<commit_message>
docs: quote exact memory changes and observed comparisons
</commit_message>
<xml_diff>
--- a/docs/reports/memory-management-draft.docx
+++ b/docs/reports/memory-management-draft.docx
@@ -76,24 +76,1045 @@
         <w:pStyle w:val="Heading1"/>
       </w:pPr>
       <w:r>
-        <w:t>1 Purpose and scope</w:t>
+        <w:t>Direct comparison: what this project added</w:t>
       </w:r>
     </w:p>
     <w:p>
       <w:r>
-        <w:t>This draft documents the memory-management part of xv6 Plus for discussion with a teacher. The work adds lazy heap allocation, copy-on-write fork, a memory-statistics interface, disk swapping, and FIFO and Clock replacement to a pinned historical xv6 baseline. It records what changed, how the mechanisms interact, the experiments that were actually observed, and the evidence suitable for a classroom demonstration.</w:t>
-      </w:r>
+        <w:t>The comparison uses named historical checkpoints of this project. Newer MIT xv6 already differs from the chosen eager starting point. Read this overview with the exact code excerpts in Appendices A-E and the quoted observed outputs in Appendix F; source links resolve to immutable commits.</w:t>
+      </w:r>
+    </w:p>
+    <w:tbl>
+      <w:tblPr>
+        <w:tblW w:type="dxa" w:w="10080"/>
+        <w:jc w:val="center"/>
+        <w:tblLayout w:type="fixed"/>
+        <w:tblLook w:firstColumn="1" w:firstRow="1" w:lastColumn="0" w:lastRow="0" w:noHBand="0" w:noVBand="1" w:val="04A0"/>
+      </w:tblPr>
+      <w:tblGrid>
+        <w:gridCol w:w="1512"/>
+        <w:gridCol w:w="2376"/>
+        <w:gridCol w:w="3096"/>
+        <w:gridCol w:w="3096"/>
+      </w:tblGrid>
+      <w:tr>
+        <w:trPr>
+          <w:cantSplit/>
+          <w:tblHeader/>
+        </w:trPr>
+        <w:tc>
+          <w:tcPr>
+            <w:tcW w:type="dxa" w:w="1512"/>
+            <w:vAlign w:val="center"/>
+            <w:tcMar>
+              <w:top w:w="85" w:type="dxa"/>
+              <w:bottom w:w="85" w:type="dxa"/>
+              <w:left w:w="85" w:type="dxa"/>
+              <w:right w:w="85" w:type="dxa"/>
+            </w:tcMar>
+            <w:shd w:fill="DFE8EF"/>
+            <w:tcBorders>
+              <w:top w:val="single" w:sz="4" w:color="D9D9D9"/>
+              <w:bottom w:val="single" w:sz="4" w:color="D9D9D9"/>
+              <w:left w:val="single" w:sz="4" w:color="D9D9D9"/>
+              <w:right w:val="single" w:sz="4" w:color="D9D9D9"/>
+            </w:tcBorders>
+          </w:tcPr>
+          <w:p>
+            <w:pPr>
+              <w:spacing w:before="40" w:after="60" w:line="245" w:lineRule="auto"/>
+            </w:pPr>
+            <w:r>
+              <w:rPr>
+                <w:b/>
+                <w:sz w:val="19"/>
+              </w:rPr>
+              <w:t>Feature</w:t>
+            </w:r>
+          </w:p>
+        </w:tc>
+        <w:tc>
+          <w:tcPr>
+            <w:tcW w:type="dxa" w:w="2376"/>
+            <w:vAlign w:val="center"/>
+            <w:tcMar>
+              <w:top w:w="85" w:type="dxa"/>
+              <w:bottom w:w="85" w:type="dxa"/>
+              <w:left w:w="85" w:type="dxa"/>
+              <w:right w:w="85" w:type="dxa"/>
+            </w:tcMar>
+            <w:shd w:fill="DFE8EF"/>
+            <w:tcBorders>
+              <w:top w:val="single" w:sz="4" w:color="D9D9D9"/>
+              <w:bottom w:val="single" w:sz="4" w:color="D9D9D9"/>
+              <w:left w:val="single" w:sz="4" w:color="D9D9D9"/>
+              <w:right w:val="single" w:sz="4" w:color="D9D9D9"/>
+            </w:tcBorders>
+          </w:tcPr>
+          <w:p>
+            <w:pPr>
+              <w:spacing w:before="40" w:after="60" w:line="245" w:lineRule="auto"/>
+            </w:pPr>
+            <w:r>
+              <w:rPr>
+                <w:b/>
+                <w:sz w:val="19"/>
+              </w:rPr>
+              <w:t>Earlier behavior</w:t>
+            </w:r>
+          </w:p>
+        </w:tc>
+        <w:tc>
+          <w:tcPr>
+            <w:tcW w:type="dxa" w:w="3096"/>
+            <w:vAlign w:val="center"/>
+            <w:tcMar>
+              <w:top w:w="85" w:type="dxa"/>
+              <w:bottom w:w="85" w:type="dxa"/>
+              <w:left w:w="85" w:type="dxa"/>
+              <w:right w:w="85" w:type="dxa"/>
+            </w:tcMar>
+            <w:shd w:fill="DFE8EF"/>
+            <w:tcBorders>
+              <w:top w:val="single" w:sz="4" w:color="D9D9D9"/>
+              <w:bottom w:val="single" w:sz="4" w:color="D9D9D9"/>
+              <w:left w:val="single" w:sz="4" w:color="D9D9D9"/>
+              <w:right w:val="single" w:sz="4" w:color="D9D9D9"/>
+            </w:tcBorders>
+          </w:tcPr>
+          <w:p>
+            <w:pPr>
+              <w:spacing w:before="40" w:after="60" w:line="245" w:lineRule="auto"/>
+            </w:pPr>
+            <w:r>
+              <w:rPr>
+                <w:b/>
+                <w:sz w:val="19"/>
+              </w:rPr>
+              <w:t>Code added or changed</w:t>
+            </w:r>
+          </w:p>
+        </w:tc>
+        <w:tc>
+          <w:tcPr>
+            <w:tcW w:type="dxa" w:w="3096"/>
+            <w:vAlign w:val="center"/>
+            <w:tcMar>
+              <w:top w:w="85" w:type="dxa"/>
+              <w:bottom w:w="85" w:type="dxa"/>
+              <w:left w:w="85" w:type="dxa"/>
+              <w:right w:w="85" w:type="dxa"/>
+            </w:tcMar>
+            <w:shd w:fill="DFE8EF"/>
+            <w:tcBorders>
+              <w:top w:val="single" w:sz="4" w:color="D9D9D9"/>
+              <w:bottom w:val="single" w:sz="4" w:color="D9D9D9"/>
+              <w:left w:val="single" w:sz="4" w:color="D9D9D9"/>
+              <w:right w:val="single" w:sz="4" w:color="D9D9D9"/>
+            </w:tcBorders>
+          </w:tcPr>
+          <w:p>
+            <w:pPr>
+              <w:spacing w:before="40" w:after="60" w:line="245" w:lineRule="auto"/>
+            </w:pPr>
+            <w:r>
+              <w:rPr>
+                <w:b/>
+                <w:sz w:val="19"/>
+              </w:rPr>
+              <w:t>Observed result</w:t>
+            </w:r>
+          </w:p>
+        </w:tc>
+      </w:tr>
+      <w:tr>
+        <w:trPr>
+          <w:cantSplit/>
+        </w:trPr>
+        <w:tc>
+          <w:tcPr>
+            <w:tcW w:type="dxa" w:w="1512"/>
+            <w:vAlign w:val="center"/>
+            <w:tcMar>
+              <w:top w:w="85" w:type="dxa"/>
+              <w:bottom w:w="85" w:type="dxa"/>
+              <w:left w:w="85" w:type="dxa"/>
+              <w:right w:w="85" w:type="dxa"/>
+            </w:tcMar>
+            <w:shd w:fill="FFFFFF"/>
+            <w:tcBorders>
+              <w:top w:val="single" w:sz="4" w:color="D9D9D9"/>
+              <w:bottom w:val="single" w:sz="4" w:color="D9D9D9"/>
+              <w:left w:val="single" w:sz="4" w:color="D9D9D9"/>
+              <w:right w:val="single" w:sz="4" w:color="D9D9D9"/>
+            </w:tcBorders>
+          </w:tcPr>
+          <w:p>
+            <w:pPr>
+              <w:spacing w:before="40" w:after="60" w:line="245" w:lineRule="auto"/>
+            </w:pPr>
+            <w:r>
+              <w:rPr>
+                <w:b w:val="0"/>
+                <w:sz w:val="19"/>
+              </w:rPr>
+              <w:t>Lazy allocation</w:t>
+            </w:r>
+          </w:p>
+        </w:tc>
+        <w:tc>
+          <w:tcPr>
+            <w:tcW w:type="dxa" w:w="2376"/>
+            <w:vAlign w:val="center"/>
+            <w:tcMar>
+              <w:top w:w="85" w:type="dxa"/>
+              <w:bottom w:w="85" w:type="dxa"/>
+              <w:left w:w="85" w:type="dxa"/>
+              <w:right w:w="85" w:type="dxa"/>
+            </w:tcMar>
+            <w:shd w:fill="FFFFFF"/>
+            <w:tcBorders>
+              <w:top w:val="single" w:sz="4" w:color="D9D9D9"/>
+              <w:bottom w:val="single" w:sz="4" w:color="D9D9D9"/>
+              <w:left w:val="single" w:sz="4" w:color="D9D9D9"/>
+              <w:right w:val="single" w:sz="4" w:color="D9D9D9"/>
+            </w:tcBorders>
+          </w:tcPr>
+          <w:p>
+            <w:pPr>
+              <w:spacing w:before="40" w:after="60" w:line="245" w:lineRule="auto"/>
+            </w:pPr>
+            <w:r>
+              <w:rPr>
+                <w:b w:val="0"/>
+                <w:sz w:val="19"/>
+              </w:rPr>
+              <w:t>v0.0 sys_sbrk calls growproc immediately</w:t>
+            </w:r>
+          </w:p>
+        </w:tc>
+        <w:tc>
+          <w:tcPr>
+            <w:tcW w:type="dxa" w:w="3096"/>
+            <w:vAlign w:val="center"/>
+            <w:tcMar>
+              <w:top w:w="85" w:type="dxa"/>
+              <w:bottom w:w="85" w:type="dxa"/>
+              <w:left w:w="85" w:type="dxa"/>
+              <w:right w:w="85" w:type="dxa"/>
+            </w:tcMar>
+            <w:shd w:fill="FFFFFF"/>
+            <w:tcBorders>
+              <w:top w:val="single" w:sz="4" w:color="D9D9D9"/>
+              <w:bottom w:val="single" w:sz="4" w:color="D9D9D9"/>
+              <w:left w:val="single" w:sz="4" w:color="D9D9D9"/>
+              <w:right w:val="single" w:sz="4" w:color="D9D9D9"/>
+            </w:tcBorders>
+          </w:tcPr>
+          <w:p>
+            <w:pPr>
+              <w:spacing w:before="40" w:after="60" w:line="245" w:lineRule="auto"/>
+            </w:pPr>
+            <w:r>
+              <w:rPr>
+                <w:b w:val="0"/>
+                <w:sz w:val="19"/>
+              </w:rPr>
+              <w:t>v0.1 reserves size; new fault handler allocates on access; VM cleanup tolerates holes</w:t>
+            </w:r>
+          </w:p>
+        </w:tc>
+        <w:tc>
+          <w:tcPr>
+            <w:tcW w:type="dxa" w:w="3096"/>
+            <w:vAlign w:val="center"/>
+            <w:tcMar>
+              <w:top w:w="85" w:type="dxa"/>
+              <w:bottom w:w="85" w:type="dxa"/>
+              <w:left w:w="85" w:type="dxa"/>
+              <w:right w:w="85" w:type="dxa"/>
+            </w:tcMar>
+            <w:shd w:fill="FFFFFF"/>
+            <w:tcBorders>
+              <w:top w:val="single" w:sz="4" w:color="D9D9D9"/>
+              <w:bottom w:val="single" w:sz="4" w:color="D9D9D9"/>
+              <w:left w:val="single" w:sz="4" w:color="D9D9D9"/>
+              <w:right w:val="single" w:sz="4" w:color="D9D9D9"/>
+            </w:tcBorders>
+          </w:tcPr>
+          <w:p>
+            <w:pPr>
+              <w:spacing w:before="40" w:after="60" w:line="245" w:lineRule="auto"/>
+            </w:pPr>
+            <w:r>
+              <w:rPr>
+                <w:b w:val="0"/>
+                <w:sz w:val="19"/>
+              </w:rPr>
+              <w:t xml:space="preserve">200 MiB reservation: failed -&gt; succeeded. Sparse test: 656 pages touched. </w:t>
+            </w:r>
+            <w:hyperlink r:id="rId13">
+              <w:r>
+                <w:rPr>
+                  <w:color w:val="1D4ED8"/>
+                  <w:u w:val="single"/>
+                </w:rPr>
+                <w:t>[R3]</w:t>
+              </w:r>
+            </w:hyperlink>
+            <w:r>
+              <w:rPr>
+                <w:b w:val="0"/>
+                <w:sz w:val="19"/>
+              </w:rPr>
+            </w:r>
+          </w:p>
+        </w:tc>
+      </w:tr>
+      <w:tr>
+        <w:trPr>
+          <w:cantSplit/>
+        </w:trPr>
+        <w:tc>
+          <w:tcPr>
+            <w:tcW w:type="dxa" w:w="1512"/>
+            <w:vAlign w:val="center"/>
+            <w:tcMar>
+              <w:top w:w="85" w:type="dxa"/>
+              <w:bottom w:w="85" w:type="dxa"/>
+              <w:left w:w="85" w:type="dxa"/>
+              <w:right w:w="85" w:type="dxa"/>
+            </w:tcMar>
+            <w:shd w:fill="F5F7F9"/>
+            <w:tcBorders>
+              <w:top w:val="single" w:sz="4" w:color="D9D9D9"/>
+              <w:bottom w:val="single" w:sz="4" w:color="D9D9D9"/>
+              <w:left w:val="single" w:sz="4" w:color="D9D9D9"/>
+              <w:right w:val="single" w:sz="4" w:color="D9D9D9"/>
+            </w:tcBorders>
+          </w:tcPr>
+          <w:p>
+            <w:pPr>
+              <w:spacing w:before="40" w:after="60" w:line="245" w:lineRule="auto"/>
+            </w:pPr>
+            <w:r>
+              <w:rPr>
+                <w:b w:val="0"/>
+                <w:sz w:val="19"/>
+              </w:rPr>
+              <w:t>COW fork</w:t>
+            </w:r>
+          </w:p>
+        </w:tc>
+        <w:tc>
+          <w:tcPr>
+            <w:tcW w:type="dxa" w:w="2376"/>
+            <w:vAlign w:val="center"/>
+            <w:tcMar>
+              <w:top w:w="85" w:type="dxa"/>
+              <w:bottom w:w="85" w:type="dxa"/>
+              <w:left w:w="85" w:type="dxa"/>
+              <w:right w:w="85" w:type="dxa"/>
+            </w:tcMar>
+            <w:shd w:fill="F5F7F9"/>
+            <w:tcBorders>
+              <w:top w:val="single" w:sz="4" w:color="D9D9D9"/>
+              <w:bottom w:val="single" w:sz="4" w:color="D9D9D9"/>
+              <w:left w:val="single" w:sz="4" w:color="D9D9D9"/>
+              <w:right w:val="single" w:sz="4" w:color="D9D9D9"/>
+            </w:tcBorders>
+          </w:tcPr>
+          <w:p>
+            <w:pPr>
+              <w:spacing w:before="40" w:after="60" w:line="245" w:lineRule="auto"/>
+            </w:pPr>
+            <w:r>
+              <w:rPr>
+                <w:b w:val="0"/>
+                <w:sz w:val="19"/>
+              </w:rPr>
+              <w:t>28c7475 uvmcopy allocates and copies each mapped page</w:t>
+            </w:r>
+          </w:p>
+        </w:tc>
+        <w:tc>
+          <w:tcPr>
+            <w:tcW w:type="dxa" w:w="3096"/>
+            <w:vAlign w:val="center"/>
+            <w:tcMar>
+              <w:top w:w="85" w:type="dxa"/>
+              <w:bottom w:w="85" w:type="dxa"/>
+              <w:left w:w="85" w:type="dxa"/>
+              <w:right w:w="85" w:type="dxa"/>
+            </w:tcMar>
+            <w:shd w:fill="F5F7F9"/>
+            <w:tcBorders>
+              <w:top w:val="single" w:sz="4" w:color="D9D9D9"/>
+              <w:bottom w:val="single" w:sz="4" w:color="D9D9D9"/>
+              <w:left w:val="single" w:sz="4" w:color="D9D9D9"/>
+              <w:right w:val="single" w:sz="4" w:color="D9D9D9"/>
+            </w:tcBorders>
+          </w:tcPr>
+          <w:p>
+            <w:pPr>
+              <w:spacing w:before="40" w:after="60" w:line="245" w:lineRule="auto"/>
+            </w:pPr>
+            <w:r>
+              <w:rPr>
+                <w:b w:val="0"/>
+                <w:sz w:val="19"/>
+              </w:rPr>
+              <w:t>v0.2 shares protected frames, tracks references and recovers private writes</w:t>
+            </w:r>
+          </w:p>
+        </w:tc>
+        <w:tc>
+          <w:tcPr>
+            <w:tcW w:type="dxa" w:w="3096"/>
+            <w:vAlign w:val="center"/>
+            <w:tcMar>
+              <w:top w:w="85" w:type="dxa"/>
+              <w:bottom w:w="85" w:type="dxa"/>
+              <w:left w:w="85" w:type="dxa"/>
+              <w:right w:w="85" w:type="dxa"/>
+            </w:tcMar>
+            <w:shd w:fill="F5F7F9"/>
+            <w:tcBorders>
+              <w:top w:val="single" w:sz="4" w:color="D9D9D9"/>
+              <w:bottom w:val="single" w:sz="4" w:color="D9D9D9"/>
+              <w:left w:val="single" w:sz="4" w:color="D9D9D9"/>
+              <w:right w:val="single" w:sz="4" w:color="D9D9D9"/>
+            </w:tcBorders>
+          </w:tcPr>
+          <w:p>
+            <w:pPr>
+              <w:spacing w:before="40" w:after="60" w:line="245" w:lineRule="auto"/>
+            </w:pPr>
+            <w:r>
+              <w:rPr>
+                <w:b w:val="0"/>
+                <w:sz w:val="19"/>
+              </w:rPr>
+              <w:t xml:space="preserve">80 MiB cowtest: fork failed -&gt; OK. Fork loop: 38 ticks before; 6 in historical v0.4. </w:t>
+            </w:r>
+            <w:hyperlink r:id="rId14">
+              <w:r>
+                <w:rPr>
+                  <w:color w:val="1D4ED8"/>
+                  <w:u w:val="single"/>
+                </w:rPr>
+                <w:t>[R4]</w:t>
+              </w:r>
+            </w:hyperlink>
+            <w:r>
+              <w:rPr>
+                <w:b w:val="0"/>
+                <w:sz w:val="19"/>
+              </w:rPr>
+            </w:r>
+          </w:p>
+        </w:tc>
+      </w:tr>
+      <w:tr>
+        <w:trPr>
+          <w:cantSplit/>
+        </w:trPr>
+        <w:tc>
+          <w:tcPr>
+            <w:tcW w:type="dxa" w:w="1512"/>
+            <w:vAlign w:val="center"/>
+            <w:tcMar>
+              <w:top w:w="85" w:type="dxa"/>
+              <w:bottom w:w="85" w:type="dxa"/>
+              <w:left w:w="85" w:type="dxa"/>
+              <w:right w:w="85" w:type="dxa"/>
+            </w:tcMar>
+            <w:shd w:fill="FFFFFF"/>
+            <w:tcBorders>
+              <w:top w:val="single" w:sz="4" w:color="D9D9D9"/>
+              <w:bottom w:val="single" w:sz="4" w:color="D9D9D9"/>
+              <w:left w:val="single" w:sz="4" w:color="D9D9D9"/>
+              <w:right w:val="single" w:sz="4" w:color="D9D9D9"/>
+            </w:tcBorders>
+          </w:tcPr>
+          <w:p>
+            <w:pPr>
+              <w:spacing w:before="40" w:after="60" w:line="245" w:lineRule="auto"/>
+            </w:pPr>
+            <w:r>
+              <w:rPr>
+                <w:b w:val="0"/>
+                <w:sz w:val="19"/>
+              </w:rPr>
+              <w:t>Memory statistics</w:t>
+            </w:r>
+          </w:p>
+        </w:tc>
+        <w:tc>
+          <w:tcPr>
+            <w:tcW w:type="dxa" w:w="2376"/>
+            <w:vAlign w:val="center"/>
+            <w:tcMar>
+              <w:top w:w="85" w:type="dxa"/>
+              <w:bottom w:w="85" w:type="dxa"/>
+              <w:left w:w="85" w:type="dxa"/>
+              <w:right w:w="85" w:type="dxa"/>
+            </w:tcMar>
+            <w:shd w:fill="FFFFFF"/>
+            <w:tcBorders>
+              <w:top w:val="single" w:sz="4" w:color="D9D9D9"/>
+              <w:bottom w:val="single" w:sz="4" w:color="D9D9D9"/>
+              <w:left w:val="single" w:sz="4" w:color="D9D9D9"/>
+              <w:right w:val="single" w:sz="4" w:color="D9D9D9"/>
+            </w:tcBorders>
+          </w:tcPr>
+          <w:p>
+            <w:pPr>
+              <w:spacing w:before="40" w:after="60" w:line="245" w:lineRule="auto"/>
+            </w:pPr>
+            <w:r>
+              <w:rPr>
+                <w:b w:val="0"/>
+                <w:sz w:val="19"/>
+              </w:rPr>
+              <w:t>v0.2 has no memstat syscall/header</w:t>
+            </w:r>
+          </w:p>
+        </w:tc>
+        <w:tc>
+          <w:tcPr>
+            <w:tcW w:type="dxa" w:w="3096"/>
+            <w:vAlign w:val="center"/>
+            <w:tcMar>
+              <w:top w:w="85" w:type="dxa"/>
+              <w:bottom w:w="85" w:type="dxa"/>
+              <w:left w:w="85" w:type="dxa"/>
+              <w:right w:w="85" w:type="dxa"/>
+            </w:tcMar>
+            <w:shd w:fill="FFFFFF"/>
+            <w:tcBorders>
+              <w:top w:val="single" w:sz="4" w:color="D9D9D9"/>
+              <w:bottom w:val="single" w:sz="4" w:color="D9D9D9"/>
+              <w:left w:val="single" w:sz="4" w:color="D9D9D9"/>
+              <w:right w:val="single" w:sz="4" w:color="D9D9D9"/>
+            </w:tcBorders>
+          </w:tcPr>
+          <w:p>
+            <w:pPr>
+              <w:spacing w:before="40" w:after="60" w:line="245" w:lineRule="auto"/>
+            </w:pPr>
+            <w:r>
+              <w:rPr>
+                <w:b w:val="0"/>
+                <w:sz w:val="19"/>
+              </w:rPr>
+              <w:t>v0.3 adds seven-field structure, syscall 22, counters and user command</w:t>
+            </w:r>
+          </w:p>
+        </w:tc>
+        <w:tc>
+          <w:tcPr>
+            <w:tcW w:type="dxa" w:w="3096"/>
+            <w:vAlign w:val="center"/>
+            <w:tcMar>
+              <w:top w:w="85" w:type="dxa"/>
+              <w:bottom w:w="85" w:type="dxa"/>
+              <w:left w:w="85" w:type="dxa"/>
+              <w:right w:w="85" w:type="dxa"/>
+            </w:tcMar>
+            <w:shd w:fill="FFFFFF"/>
+            <w:tcBorders>
+              <w:top w:val="single" w:sz="4" w:color="D9D9D9"/>
+              <w:bottom w:val="single" w:sz="4" w:color="D9D9D9"/>
+              <w:left w:val="single" w:sz="4" w:color="D9D9D9"/>
+              <w:right w:val="single" w:sz="4" w:color="D9D9D9"/>
+            </w:tcBorders>
+          </w:tcPr>
+          <w:p>
+            <w:pPr>
+              <w:spacing w:before="40" w:after="60" w:line="245" w:lineRule="auto"/>
+            </w:pPr>
+            <w:r>
+              <w:rPr>
+                <w:b w:val="0"/>
+                <w:sz w:val="19"/>
+              </w:rPr>
+              <w:t xml:space="preserve">After cowtest: faults 4 -&gt; 20518; COW copies 2 -&gt; 27; free pages 32500 -&gt; 32500. </w:t>
+            </w:r>
+            <w:hyperlink r:id="rId15">
+              <w:r>
+                <w:rPr>
+                  <w:color w:val="1D4ED8"/>
+                  <w:u w:val="single"/>
+                </w:rPr>
+                <w:t>[R5]</w:t>
+              </w:r>
+            </w:hyperlink>
+            <w:r>
+              <w:rPr>
+                <w:b w:val="0"/>
+                <w:sz w:val="19"/>
+              </w:rPr>
+            </w:r>
+          </w:p>
+        </w:tc>
+      </w:tr>
+      <w:tr>
+        <w:trPr>
+          <w:cantSplit/>
+        </w:trPr>
+        <w:tc>
+          <w:tcPr>
+            <w:tcW w:type="dxa" w:w="1512"/>
+            <w:vAlign w:val="center"/>
+            <w:tcMar>
+              <w:top w:w="85" w:type="dxa"/>
+              <w:bottom w:w="85" w:type="dxa"/>
+              <w:left w:w="85" w:type="dxa"/>
+              <w:right w:w="85" w:type="dxa"/>
+            </w:tcMar>
+            <w:shd w:fill="F5F7F9"/>
+            <w:tcBorders>
+              <w:top w:val="single" w:sz="4" w:color="D9D9D9"/>
+              <w:bottom w:val="single" w:sz="4" w:color="D9D9D9"/>
+              <w:left w:val="single" w:sz="4" w:color="D9D9D9"/>
+              <w:right w:val="single" w:sz="4" w:color="D9D9D9"/>
+            </w:tcBorders>
+          </w:tcPr>
+          <w:p>
+            <w:pPr>
+              <w:spacing w:before="40" w:after="60" w:line="245" w:lineRule="auto"/>
+            </w:pPr>
+            <w:r>
+              <w:rPr>
+                <w:b w:val="0"/>
+                <w:sz w:val="19"/>
+              </w:rPr>
+              <w:t>Disk swapping</w:t>
+            </w:r>
+          </w:p>
+        </w:tc>
+        <w:tc>
+          <w:tcPr>
+            <w:tcW w:type="dxa" w:w="2376"/>
+            <w:vAlign w:val="center"/>
+            <w:tcMar>
+              <w:top w:w="85" w:type="dxa"/>
+              <w:bottom w:w="85" w:type="dxa"/>
+              <w:left w:w="85" w:type="dxa"/>
+              <w:right w:w="85" w:type="dxa"/>
+            </w:tcMar>
+            <w:shd w:fill="F5F7F9"/>
+            <w:tcBorders>
+              <w:top w:val="single" w:sz="4" w:color="D9D9D9"/>
+              <w:bottom w:val="single" w:sz="4" w:color="D9D9D9"/>
+              <w:left w:val="single" w:sz="4" w:color="D9D9D9"/>
+              <w:right w:val="single" w:sz="4" w:color="D9D9D9"/>
+            </w:tcBorders>
+          </w:tcPr>
+          <w:p>
+            <w:pPr>
+              <w:spacing w:before="40" w:after="60" w:line="245" w:lineRule="auto"/>
+            </w:pPr>
+            <w:r>
+              <w:rPr>
+                <w:b w:val="0"/>
+                <w:sz w:val="19"/>
+              </w:rPr>
+              <w:t>before-swap returns failure when a required frame is unavailable</w:t>
+            </w:r>
+          </w:p>
+        </w:tc>
+        <w:tc>
+          <w:tcPr>
+            <w:tcW w:type="dxa" w:w="3096"/>
+            <w:vAlign w:val="center"/>
+            <w:tcMar>
+              <w:top w:w="85" w:type="dxa"/>
+              <w:bottom w:w="85" w:type="dxa"/>
+              <w:left w:w="85" w:type="dxa"/>
+              <w:right w:w="85" w:type="dxa"/>
+            </w:tcMar>
+            <w:shd w:fill="F5F7F9"/>
+            <w:tcBorders>
+              <w:top w:val="single" w:sz="4" w:color="D9D9D9"/>
+              <w:bottom w:val="single" w:sz="4" w:color="D9D9D9"/>
+              <w:left w:val="single" w:sz="4" w:color="D9D9D9"/>
+              <w:right w:val="single" w:sz="4" w:color="D9D9D9"/>
+            </w:tcBorders>
+          </w:tcPr>
+          <w:p>
+            <w:pPr>
+              <w:spacing w:before="40" w:after="60" w:line="245" w:lineRule="auto"/>
+            </w:pPr>
+            <w:r>
+              <w:rPr>
+                <w:b w:val="0"/>
+                <w:sz w:val="19"/>
+              </w:rPr>
+              <w:t>v0.4 adds disk slots, eviction/restore and PTE encoding; extends the earlier statistics stub</w:t>
+            </w:r>
+          </w:p>
+        </w:tc>
+        <w:tc>
+          <w:tcPr>
+            <w:tcW w:type="dxa" w:w="3096"/>
+            <w:vAlign w:val="center"/>
+            <w:tcMar>
+              <w:top w:w="85" w:type="dxa"/>
+              <w:bottom w:w="85" w:type="dxa"/>
+              <w:left w:w="85" w:type="dxa"/>
+              <w:right w:w="85" w:type="dxa"/>
+            </w:tcMar>
+            <w:shd w:fill="F5F7F9"/>
+            <w:tcBorders>
+              <w:top w:val="single" w:sz="4" w:color="D9D9D9"/>
+              <w:bottom w:val="single" w:sz="4" w:color="D9D9D9"/>
+              <w:left w:val="single" w:sz="4" w:color="D9D9D9"/>
+              <w:right w:val="single" w:sz="4" w:color="D9D9D9"/>
+            </w:tcBorders>
+          </w:tcPr>
+          <w:p>
+            <w:pPr>
+              <w:spacing w:before="40" w:after="60" w:line="245" w:lineRule="auto"/>
+            </w:pPr>
+            <w:r>
+              <w:rPr>
+                <w:b w:val="0"/>
+                <w:sz w:val="19"/>
+              </w:rPr>
+              <w:t xml:space="preserve">Under 8 MiB usable RAM: 12 MiB workload exit -1 -&gt; exit 0, all 3072 pages verified. </w:t>
+            </w:r>
+            <w:hyperlink r:id="rId16">
+              <w:r>
+                <w:rPr>
+                  <w:color w:val="1D4ED8"/>
+                  <w:u w:val="single"/>
+                </w:rPr>
+                <w:t>[R6]</w:t>
+              </w:r>
+            </w:hyperlink>
+            <w:r>
+              <w:rPr>
+                <w:b w:val="0"/>
+                <w:sz w:val="19"/>
+              </w:rPr>
+            </w:r>
+          </w:p>
+        </w:tc>
+      </w:tr>
+      <w:tr>
+        <w:trPr>
+          <w:cantSplit/>
+        </w:trPr>
+        <w:tc>
+          <w:tcPr>
+            <w:tcW w:type="dxa" w:w="1512"/>
+            <w:vAlign w:val="center"/>
+            <w:tcMar>
+              <w:top w:w="85" w:type="dxa"/>
+              <w:bottom w:w="85" w:type="dxa"/>
+              <w:left w:w="85" w:type="dxa"/>
+              <w:right w:w="85" w:type="dxa"/>
+            </w:tcMar>
+            <w:shd w:fill="FFFFFF"/>
+            <w:tcBorders>
+              <w:top w:val="single" w:sz="4" w:color="D9D9D9"/>
+              <w:bottom w:val="single" w:sz="4" w:color="D9D9D9"/>
+              <w:left w:val="single" w:sz="4" w:color="D9D9D9"/>
+              <w:right w:val="single" w:sz="4" w:color="D9D9D9"/>
+            </w:tcBorders>
+          </w:tcPr>
+          <w:p>
+            <w:pPr>
+              <w:spacing w:before="40" w:after="60" w:line="245" w:lineRule="auto"/>
+            </w:pPr>
+            <w:r>
+              <w:rPr>
+                <w:b w:val="0"/>
+                <w:sz w:val="19"/>
+              </w:rPr>
+              <w:t>FIFO / Clock</w:t>
+            </w:r>
+          </w:p>
+        </w:tc>
+        <w:tc>
+          <w:tcPr>
+            <w:tcW w:type="dxa" w:w="2376"/>
+            <w:vAlign w:val="center"/>
+            <w:tcMar>
+              <w:top w:w="85" w:type="dxa"/>
+              <w:bottom w:w="85" w:type="dxa"/>
+              <w:left w:w="85" w:type="dxa"/>
+              <w:right w:w="85" w:type="dxa"/>
+            </w:tcMar>
+            <w:shd w:fill="FFFFFF"/>
+            <w:tcBorders>
+              <w:top w:val="single" w:sz="4" w:color="D9D9D9"/>
+              <w:bottom w:val="single" w:sz="4" w:color="D9D9D9"/>
+              <w:left w:val="single" w:sz="4" w:color="D9D9D9"/>
+              <w:right w:val="single" w:sz="4" w:color="D9D9D9"/>
+            </w:tcBorders>
+          </w:tcPr>
+          <w:p>
+            <w:pPr>
+              <w:spacing w:before="40" w:after="60" w:line="245" w:lineRule="auto"/>
+            </w:pPr>
+            <w:r>
+              <w:rPr>
+                <w:b w:val="0"/>
+                <w:sz w:val="19"/>
+              </w:rPr>
+              <w:t>No disk-backed victim-selection engine in before-swap</w:t>
+            </w:r>
+          </w:p>
+        </w:tc>
+        <w:tc>
+          <w:tcPr>
+            <w:tcW w:type="dxa" w:w="3096"/>
+            <w:vAlign w:val="center"/>
+            <w:tcMar>
+              <w:top w:w="85" w:type="dxa"/>
+              <w:bottom w:w="85" w:type="dxa"/>
+              <w:left w:w="85" w:type="dxa"/>
+              <w:right w:w="85" w:type="dxa"/>
+            </w:tcMar>
+            <w:shd w:fill="FFFFFF"/>
+            <w:tcBorders>
+              <w:top w:val="single" w:sz="4" w:color="D9D9D9"/>
+              <w:bottom w:val="single" w:sz="4" w:color="D9D9D9"/>
+              <w:left w:val="single" w:sz="4" w:color="D9D9D9"/>
+              <w:right w:val="single" w:sz="4" w:color="D9D9D9"/>
+            </w:tcBorders>
+          </w:tcPr>
+          <w:p>
+            <w:pPr>
+              <w:spacing w:before="40" w:after="60" w:line="245" w:lineRule="auto"/>
+            </w:pPr>
+            <w:r>
+              <w:rPr>
+                <w:b w:val="0"/>
+                <w:sz w:val="19"/>
+              </w:rPr>
+              <w:t>FIFO selects oldest tracked eligible frame; Clock tests/clears accessed bits</w:t>
+            </w:r>
+          </w:p>
+        </w:tc>
+        <w:tc>
+          <w:tcPr>
+            <w:tcW w:type="dxa" w:w="3096"/>
+            <w:vAlign w:val="center"/>
+            <w:tcMar>
+              <w:top w:w="85" w:type="dxa"/>
+              <w:bottom w:w="85" w:type="dxa"/>
+              <w:left w:w="85" w:type="dxa"/>
+              <w:right w:w="85" w:type="dxa"/>
+            </w:tcMar>
+            <w:shd w:fill="FFFFFF"/>
+            <w:tcBorders>
+              <w:top w:val="single" w:sz="4" w:color="D9D9D9"/>
+              <w:bottom w:val="single" w:sz="4" w:color="D9D9D9"/>
+              <w:left w:val="single" w:sz="4" w:color="D9D9D9"/>
+              <w:right w:val="single" w:sz="4" w:color="D9D9D9"/>
+            </w:tcBorders>
+          </w:tcPr>
+          <w:p>
+            <w:pPr>
+              <w:spacing w:before="40" w:after="60" w:line="245" w:lineRule="auto"/>
+            </w:pPr>
+            <w:r>
+              <w:rPr>
+                <w:b w:val="0"/>
+                <w:sz w:val="19"/>
+              </w:rPr>
+              <w:t xml:space="preserve">Historical phases: FIFO 8006 ins/8007 outs; Clock 7691/7684. One phase per policy. </w:t>
+            </w:r>
+            <w:hyperlink r:id="rId17">
+              <w:r>
+                <w:rPr>
+                  <w:color w:val="1D4ED8"/>
+                  <w:u w:val="single"/>
+                </w:rPr>
+                <w:t>[R7]</w:t>
+              </w:r>
+            </w:hyperlink>
+            <w:r>
+              <w:rPr>
+                <w:b w:val="0"/>
+                <w:sz w:val="19"/>
+              </w:rPr>
+            </w:r>
+          </w:p>
+        </w:tc>
+      </w:tr>
+      <w:tr>
+        <w:trPr>
+          <w:cantSplit/>
+        </w:trPr>
+        <w:tc>
+          <w:tcPr>
+            <w:tcW w:type="dxa" w:w="1512"/>
+            <w:vAlign w:val="center"/>
+            <w:tcMar>
+              <w:top w:w="85" w:type="dxa"/>
+              <w:bottom w:w="85" w:type="dxa"/>
+              <w:left w:w="85" w:type="dxa"/>
+              <w:right w:w="85" w:type="dxa"/>
+            </w:tcMar>
+            <w:shd w:fill="F5F7F9"/>
+            <w:tcBorders>
+              <w:top w:val="single" w:sz="4" w:color="D9D9D9"/>
+              <w:bottom w:val="single" w:sz="4" w:color="D9D9D9"/>
+              <w:left w:val="single" w:sz="4" w:color="D9D9D9"/>
+              <w:right w:val="single" w:sz="4" w:color="D9D9D9"/>
+            </w:tcBorders>
+          </w:tcPr>
+          <w:p>
+            <w:pPr>
+              <w:spacing w:before="40" w:after="60" w:line="245" w:lineRule="auto"/>
+            </w:pPr>
+            <w:r>
+              <w:rPr>
+                <w:b w:val="0"/>
+                <w:sz w:val="19"/>
+              </w:rPr>
+              <w:t>Regression integration</w:t>
+            </w:r>
+          </w:p>
+        </w:tc>
+        <w:tc>
+          <w:tcPr>
+            <w:tcW w:type="dxa" w:w="2376"/>
+            <w:vAlign w:val="center"/>
+            <w:tcMar>
+              <w:top w:w="85" w:type="dxa"/>
+              <w:bottom w:w="85" w:type="dxa"/>
+              <w:left w:w="85" w:type="dxa"/>
+              <w:right w:w="85" w:type="dxa"/>
+            </w:tcMar>
+            <w:shd w:fill="F5F7F9"/>
+            <w:tcBorders>
+              <w:top w:val="single" w:sz="4" w:color="D9D9D9"/>
+              <w:bottom w:val="single" w:sz="4" w:color="D9D9D9"/>
+              <w:left w:val="single" w:sz="4" w:color="D9D9D9"/>
+              <w:right w:val="single" w:sz="4" w:color="D9D9D9"/>
+            </w:tcBorders>
+          </w:tcPr>
+          <w:p>
+            <w:pPr>
+              <w:spacing w:before="40" w:after="60" w:line="245" w:lineRule="auto"/>
+            </w:pPr>
+            <w:r>
+              <w:rPr>
+                <w:b w:val="0"/>
+                <w:sz w:val="19"/>
+              </w:rPr>
+              <w:t>Memory recovery can require allocation or sleeping I/O</w:t>
+            </w:r>
+          </w:p>
+        </w:tc>
+        <w:tc>
+          <w:tcPr>
+            <w:tcW w:type="dxa" w:w="3096"/>
+            <w:vAlign w:val="center"/>
+            <w:tcMar>
+              <w:top w:w="85" w:type="dxa"/>
+              <w:bottom w:w="85" w:type="dxa"/>
+              <w:left w:w="85" w:type="dxa"/>
+              <w:right w:w="85" w:type="dxa"/>
+            </w:tcMar>
+            <w:shd w:fill="F5F7F9"/>
+            <w:tcBorders>
+              <w:top w:val="single" w:sz="4" w:color="D9D9D9"/>
+              <w:bottom w:val="single" w:sz="4" w:color="D9D9D9"/>
+              <w:left w:val="single" w:sz="4" w:color="D9D9D9"/>
+              <w:right w:val="single" w:sz="4" w:color="D9D9D9"/>
+            </w:tcBorders>
+          </w:tcPr>
+          <w:p>
+            <w:pPr>
+              <w:spacing w:before="40" w:after="60" w:line="245" w:lineRule="auto"/>
+            </w:pPr>
+            <w:r>
+              <w:rPr>
+                <w:b w:val="0"/>
+                <w:sz w:val="19"/>
+              </w:rPr>
+              <w:t>wait cleanup ordering and kernel-staged pipe copies; tests retained</w:t>
+            </w:r>
+          </w:p>
+        </w:tc>
+        <w:tc>
+          <w:tcPr>
+            <w:tcW w:type="dxa" w:w="3096"/>
+            <w:vAlign w:val="center"/>
+            <w:tcMar>
+              <w:top w:w="85" w:type="dxa"/>
+              <w:bottom w:w="85" w:type="dxa"/>
+              <w:left w:w="85" w:type="dxa"/>
+              <w:right w:w="85" w:type="dxa"/>
+            </w:tcMar>
+            <w:shd w:fill="F5F7F9"/>
+            <w:tcBorders>
+              <w:top w:val="single" w:sz="4" w:color="D9D9D9"/>
+              <w:bottom w:val="single" w:sz="4" w:color="D9D9D9"/>
+              <w:left w:val="single" w:sz="4" w:color="D9D9D9"/>
+              <w:right w:val="single" w:sz="4" w:color="D9D9D9"/>
+            </w:tcBorders>
+          </w:tcPr>
+          <w:p>
+            <w:pPr>
+              <w:spacing w:before="40" w:after="60" w:line="245" w:lineRule="auto"/>
+            </w:pPr>
+            <w:r>
+              <w:rPr>
+                <w:b w:val="0"/>
+                <w:sz w:val="19"/>
+              </w:rPr>
+              <w:t>Targeted regressions and full usertests passed after repairs.</w:t>
+            </w:r>
+          </w:p>
+        </w:tc>
+      </w:tr>
+    </w:tbl>
+    <w:p>
+      <w:pPr>
+        <w:spacing w:line="20" w:lineRule="exact" w:after="60"/>
+      </w:pPr>
     </w:p>
     <w:p>
       <w:r>
-        <w:t>The principal memory release is v0.4 at commit 93fa86d. Later v0.5–v0.9 work makes that memory subsystem usable with the project's thread foundation and adds explicit concurrency boundaries. Those later checks are identified separately. This report does not claim completion of Nikunj's tracing, signals or debugger work.</w:t>
+        <w:t>The source diff v0.0 to v0.4 adds three kernel files: pgfault.c, memstat.h and swap.c. It also adds user/cowtest.c, forkbench.c, hotcold.c, lazytest.c, memhog.c, memstat.c and swapfork.c. Existing VM, allocator, trap, syscall, process, pipe and build files are modified; existing baseline.c predates this diff. The swap.c statistics stub already existed at before-swap and was extended into the engine at v0.4.</w:t>
       </w:r>
     </w:p>
     <w:p>
       <w:r>
+        <w:t>These are educational implementations and integration results. The timing and policy numbers are historical individual observations, not controlled averages. Research references R14-R15 give conceptual context, not evidence that this project invented or fully implements those research systems.</w:t>
+      </w:r>
+    </w:p>
+    <w:p>
+      <w:pPr>
+        <w:pStyle w:val="Heading1"/>
+      </w:pPr>
+      <w:r>
+        <w:t>1 Purpose and scope</w:t>
+      </w:r>
+    </w:p>
+    <w:p>
+      <w:r>
+        <w:t>This draft documents the memory-management part of xv6 Plus for discussion with a teacher. The work adds lazy heap allocation, copy-on-write fork, a memory-statistics interface, disk swapping, and FIFO and Clock replacement to a pinned historical xv6 baseline. It records what changed, how the mechanisms interact, the experiments that were actually observed, and the evidence suitable for a classroom demonstration.</w:t>
+      </w:r>
+    </w:p>
+    <w:p>
+      <w:r>
+        <w:t>The principal memory release is v0.4 at commit 93fa86d. Later v0.5–v0.9 work makes that memory subsystem usable with the project's thread foundation and adds explicit concurrency boundaries. Those later checks are identified separately. This report does not claim completion of Nikunj's tracing, signals or debugger work.</w:t>
+      </w:r>
+    </w:p>
+    <w:p>
+      <w:r>
         <w:t xml:space="preserve">MIT xv6 supplies the original operating system, scheduler, filesystem, device drivers and source structure. Lazy allocation and COW are established techniques used in MIT laboratory assignments. The contribution here is their implementation and adaptation in this project, integration with a swap engine and diagnostic interface, regression repairs, and preserved experimental evidence. The supplied project guides and AI-assisted development supported the work; the report does not claim a new memory-management algorithm. </w:t>
       </w:r>
-      <w:hyperlink r:id="rId13">
+      <w:hyperlink r:id="rId18">
         <w:r>
           <w:rPr>
             <w:color w:val="1D4ED8"/>
@@ -105,7 +1126,7 @@
       <w:r>
         <w:t xml:space="preserve"> </w:t>
       </w:r>
-      <w:hyperlink r:id="rId14">
+      <w:hyperlink r:id="rId13">
         <w:r>
           <w:rPr>
             <w:color w:val="1D4ED8"/>
@@ -117,7 +1138,7 @@
       <w:r>
         <w:t xml:space="preserve"> </w:t>
       </w:r>
-      <w:hyperlink r:id="rId15">
+      <w:hyperlink r:id="rId14">
         <w:r>
           <w:rPr>
             <w:color w:val="1D4ED8"/>
@@ -566,7 +1587,7 @@
     </w:p>
     <w:p>
       <w:r>
-        <w:t>Read sections 2–4 for provenance and environment, 5–11 for implementation, and 12–16 for results and limitations. Sections 17–19 provide the teacher demonstration, evidence checklist and viva preparation. Section 20 maps claims to the source and checkpoints. The final two pages contain verified reference links. Formal submission details and a college-specific cover can be added later.</w:t>
+        <w:t>Read sections 2–4 for provenance and environment, 5–11 for implementation, and 12–16 for results and limitations. Sections 17–19 provide the teacher demonstration, evidence checklist and viva preparation. Section 20 maps claims to the source and checkpoints. The opening comparison overview and Appendices A-F provide exact code differences and quoted outputs. The final reference pages include official assignments, textbooks and research papers. Formal submission details and a college-specific cover can be added later.</w:t>
       </w:r>
     </w:p>
     <w:p>
@@ -757,7 +1778,7 @@
               </w:rPr>
               <w:t xml:space="preserve">MIT 6.S081 2020 lazy lab </w:t>
             </w:r>
-            <w:hyperlink r:id="rId14">
+            <w:hyperlink r:id="rId13">
               <w:r>
                 <w:rPr>
                   <w:color w:val="1D4ED8"/>
@@ -870,7 +1891,7 @@
               </w:rPr>
               <w:t xml:space="preserve">MIT 6.1810 2025 COW lab </w:t>
             </w:r>
-            <w:hyperlink r:id="rId15">
+            <w:hyperlink r:id="rId14">
               <w:r>
                 <w:rPr>
                   <w:color w:val="1D4ED8"/>
@@ -983,7 +2004,7 @@
               </w:rPr>
               <w:t xml:space="preserve">MIT 6.S081 2020 sysinfo exercise </w:t>
             </w:r>
-            <w:hyperlink r:id="rId16">
+            <w:hyperlink r:id="rId15">
               <w:r>
                 <w:rPr>
                   <w:color w:val="1D4ED8"/>
@@ -1096,7 +2117,7 @@
               </w:rPr>
               <w:t xml:space="preserve">OSTEP mechanisms chapter </w:t>
             </w:r>
-            <w:hyperlink r:id="rId17">
+            <w:hyperlink r:id="rId16">
               <w:r>
                 <w:rPr>
                   <w:color w:val="1D4ED8"/>
@@ -1209,7 +2230,7 @@
               </w:rPr>
               <w:t xml:space="preserve">OSTEP policies chapter </w:t>
             </w:r>
-            <w:hyperlink r:id="rId18">
+            <w:hyperlink r:id="rId17">
               <w:r>
                 <w:rPr>
                   <w:color w:val="1D4ED8"/>
@@ -1268,7 +2289,7 @@
       <w:r>
         <w:t xml:space="preserve">The upstream source and book repositories are the appropriate repository references. Course-specific starter repositories can differ from the book's xv6-riscv tree; MIT documents that distinction. We therefore cite official source and course material rather than treating an unverified student solution repository as evidence. </w:t>
       </w:r>
-      <w:hyperlink r:id="rId13">
+      <w:hyperlink r:id="rId18">
         <w:r>
           <w:rPr>
             <w:color w:val="1D4ED8"/>
@@ -3861,7 +4882,7 @@
       <w:r>
         <w:t xml:space="preserve">The main implementation locations are kernel/sysproc.c, kernel/pgfault.c, kernel/vm.c and kernel/trap.c. This behavior corresponds to the educational lazy-allocation exercise, while the project handler also has to coexist with COW and swapping. </w:t>
       </w:r>
-      <w:hyperlink r:id="rId14">
+      <w:hyperlink r:id="rId13">
         <w:r>
           <w:rPr>
             <w:color w:val="1D4ED8"/>
@@ -4118,7 +5139,7 @@
       <w:r>
         <w:t xml:space="preserve">These design requirements correspond directly to the COW lab's sharing, ownership and kernel-copy concerns. Our implementation and tests are integrated with the project fault handler rather than presented as a separately graded MIT lab solution. </w:t>
       </w:r>
-      <w:hyperlink r:id="rId15">
+      <w:hyperlink r:id="rId14">
         <w:r>
           <w:rPr>
             <w:color w:val="1D4ED8"/>
@@ -4634,7 +5655,7 @@
       <w:r>
         <w:t xml:space="preserve">memstat provides a shared structure, syscall 22 and a user command. Kernel wiring retrieves the user pointer, fills the structure, and copies the snapshot through the normal user-copy path. The command prints the fields in a consistent order. The related MIT sysinfo exercise is a useful syscall reference, but the interfaces differ. </w:t>
       </w:r>
-      <w:hyperlink r:id="rId16">
+      <w:hyperlink r:id="rId15">
         <w:r>
           <w:rPr>
             <w:color w:val="1D4ED8"/>
@@ -5203,7 +6224,7 @@
       <w:r>
         <w:t xml:space="preserve">The swap engine supplies backing storage once a valid working set cannot remain in usable RAM. It maintains frame metadata containing a page table, virtual address and tracking sequence. Eligible pages are written through the existing block I/O path into a reserved area after the filesystem. This is a project extension grounded in standard disk-backed memory mechanisms. </w:t>
       </w:r>
-      <w:hyperlink r:id="rId17">
+      <w:hyperlink r:id="rId16">
         <w:r>
           <w:rPr>
             <w:color w:val="1D4ED8"/>
@@ -6554,7 +7575,7 @@
       <w:r>
         <w:t xml:space="preserve">Clock advances a hand through candidates. If an eligible mapping has its accessed bit set, the policy clears that bit, fences the local translation state and grants another chance. An eligible mapping encountered without that recent-use indication can be selected. It is an approximation using hardware activity information rather than an exact LRU ordering. </w:t>
       </w:r>
-      <w:hyperlink r:id="rId18">
+      <w:hyperlink r:id="rId17">
         <w:r>
           <w:rPr>
             <w:color w:val="1D4ED8"/>
@@ -11417,6 +12438,2321 @@
         <w:pStyle w:val="Heading1"/>
       </w:pPr>
       <w:r>
+        <w:t>Appendix A Exact lazy-allocation change</w:t>
+      </w:r>
+    </w:p>
+    <w:p>
+      <w:r>
+        <w:t>The following blocks are exact excerpts extracted from the saved Git objects, with pinned source links. They show the changed decisions rather than entire functions. Earlier explanatory outlines in this report are pseudocode; the appendix blocks quote actual project source, including its comments and formatting.</w:t>
+      </w:r>
+    </w:p>
+    <w:p>
+      <w:pPr>
+        <w:pStyle w:val="Heading2"/>
+      </w:pPr>
+      <w:r>
+        <w:t>Before: eager allocation at v0.0</w:t>
+      </w:r>
+    </w:p>
+    <w:p>
+      <w:r>
+        <w:t xml:space="preserve">kernel/sysproc.c, sys_sbrk(void), v0.0, lines 45-48. </w:t>
+      </w:r>
+      <w:hyperlink r:id="rId38">
+        <w:r>
+          <w:rPr>
+            <w:color w:val="1D4ED8"/>
+            <w:u w:val="single"/>
+          </w:rPr>
+          <w:t>[S1]</w:t>
+        </w:r>
+      </w:hyperlink>
+      <w:r/>
+    </w:p>
+    <w:p>
+      <w:pPr>
+        <w:spacing w:after="160" w:line="245" w:lineRule="auto"/>
+      </w:pPr>
+      <w:r>
+        <w:rPr>
+          <w:rFonts w:ascii="Consolas" w:hAnsi="Consolas"/>
+          <w:sz w:val="18"/>
+        </w:rPr>
+        <w:t xml:space="preserve">  addr = myproc()-&gt;sz;</w:t>
+      </w:r>
+      <w:r>
+        <w:br/>
+      </w:r>
+      <w:r>
+        <w:rPr>
+          <w:rFonts w:ascii="Consolas" w:hAnsi="Consolas"/>
+          <w:sz w:val="18"/>
+        </w:rPr>
+        <w:t xml:space="preserve">  if(growproc(n) &lt; 0)</w:t>
+      </w:r>
+      <w:r>
+        <w:br/>
+      </w:r>
+      <w:r>
+        <w:rPr>
+          <w:rFonts w:ascii="Consolas" w:hAnsi="Consolas"/>
+          <w:sz w:val="18"/>
+        </w:rPr>
+        <w:t xml:space="preserve">    return -1;</w:t>
+      </w:r>
+      <w:r>
+        <w:br/>
+      </w:r>
+      <w:r>
+        <w:rPr>
+          <w:rFonts w:ascii="Consolas" w:hAnsi="Consolas"/>
+          <w:sz w:val="18"/>
+        </w:rPr>
+        <w:t xml:space="preserve">  return addr;</w:t>
+      </w:r>
+    </w:p>
+    <w:p>
+      <w:pPr>
+        <w:pStyle w:val="Heading2"/>
+      </w:pPr>
+      <w:r>
+        <w:t>After: reserve first at v0.1</w:t>
+      </w:r>
+    </w:p>
+    <w:p>
+      <w:r>
+        <w:t xml:space="preserve">kernel/sysproc.c, sys_sbrk(void), v0.1, lines 47-59. </w:t>
+      </w:r>
+      <w:hyperlink r:id="rId39">
+        <w:r>
+          <w:rPr>
+            <w:color w:val="1D4ED8"/>
+            <w:u w:val="single"/>
+          </w:rPr>
+          <w:t>[S2]</w:t>
+        </w:r>
+      </w:hyperlink>
+      <w:r/>
+    </w:p>
+    <w:p>
+      <w:pPr>
+        <w:spacing w:after="160" w:line="245" w:lineRule="auto"/>
+      </w:pPr>
+      <w:r>
+        <w:rPr>
+          <w:rFonts w:ascii="Consolas" w:hAnsi="Consolas"/>
+          <w:sz w:val="18"/>
+        </w:rPr>
+        <w:t xml:space="preserve">  if(n &gt;= 0){</w:t>
+      </w:r>
+      <w:r>
+        <w:br/>
+      </w:r>
+      <w:r>
+        <w:rPr>
+          <w:rFonts w:ascii="Consolas" w:hAnsi="Consolas"/>
+          <w:sz w:val="18"/>
+        </w:rPr>
+        <w:t xml:space="preserve">    // Reserve virtual memory without allocating physical pages.</w:t>
+      </w:r>
+      <w:r>
+        <w:br/>
+      </w:r>
+      <w:r>
+        <w:rPr>
+          <w:rFonts w:ascii="Consolas" w:hAnsi="Consolas"/>
+          <w:sz w:val="18"/>
+        </w:rPr>
+        <w:t xml:space="preserve">    if(addr + n &lt; addr || addr + n &gt; TRAPFRAME)</w:t>
+      </w:r>
+      <w:r>
+        <w:br/>
+      </w:r>
+      <w:r>
+        <w:rPr>
+          <w:rFonts w:ascii="Consolas" w:hAnsi="Consolas"/>
+          <w:sz w:val="18"/>
+        </w:rPr>
+        <w:t xml:space="preserve">      return -1;</w:t>
+      </w:r>
+      <w:r>
+        <w:br/>
+      </w:r>
+      <w:r>
+        <w:rPr>
+          <w:rFonts w:ascii="Consolas" w:hAnsi="Consolas"/>
+          <w:sz w:val="18"/>
+        </w:rPr>
+      </w:r>
+      <w:r>
+        <w:br/>
+      </w:r>
+      <w:r>
+        <w:rPr>
+          <w:rFonts w:ascii="Consolas" w:hAnsi="Consolas"/>
+          <w:sz w:val="18"/>
+        </w:rPr>
+        <w:t xml:space="preserve">    p-&gt;sz = addr + n;</w:t>
+      </w:r>
+      <w:r>
+        <w:br/>
+      </w:r>
+      <w:r>
+        <w:rPr>
+          <w:rFonts w:ascii="Consolas" w:hAnsi="Consolas"/>
+          <w:sz w:val="18"/>
+        </w:rPr>
+        <w:t xml:space="preserve">  } else {</w:t>
+      </w:r>
+      <w:r>
+        <w:br/>
+      </w:r>
+      <w:r>
+        <w:rPr>
+          <w:rFonts w:ascii="Consolas" w:hAnsi="Consolas"/>
+          <w:sz w:val="18"/>
+        </w:rPr>
+        <w:t xml:space="preserve">    // Shrinking still releases allocated pages.</w:t>
+      </w:r>
+      <w:r>
+        <w:br/>
+      </w:r>
+      <w:r>
+        <w:rPr>
+          <w:rFonts w:ascii="Consolas" w:hAnsi="Consolas"/>
+          <w:sz w:val="18"/>
+        </w:rPr>
+        <w:t xml:space="preserve">    if(growproc(n) &lt; 0)</w:t>
+      </w:r>
+      <w:r>
+        <w:br/>
+      </w:r>
+      <w:r>
+        <w:rPr>
+          <w:rFonts w:ascii="Consolas" w:hAnsi="Consolas"/>
+          <w:sz w:val="18"/>
+        </w:rPr>
+        <w:t xml:space="preserve">      return -1;</w:t>
+      </w:r>
+      <w:r>
+        <w:br/>
+      </w:r>
+      <w:r>
+        <w:rPr>
+          <w:rFonts w:ascii="Consolas" w:hAnsi="Consolas"/>
+          <w:sz w:val="18"/>
+        </w:rPr>
+        <w:t xml:space="preserve">  }</w:t>
+      </w:r>
+      <w:r>
+        <w:br/>
+      </w:r>
+      <w:r>
+        <w:rPr>
+          <w:rFonts w:ascii="Consolas" w:hAnsi="Consolas"/>
+          <w:sz w:val="18"/>
+        </w:rPr>
+      </w:r>
+      <w:r>
+        <w:br/>
+      </w:r>
+      <w:r>
+        <w:rPr>
+          <w:rFonts w:ascii="Consolas" w:hAnsi="Consolas"/>
+          <w:sz w:val="18"/>
+        </w:rPr>
+        <w:t xml:space="preserve">  return addr;</w:t>
+      </w:r>
+    </w:p>
+    <w:p>
+      <w:r>
+        <w:t xml:space="preserve">The old positive request enters growproc and attempts allocation immediately. The new positive request checks the range and advances p-&gt;sz; the separate fault handler supplies a zero-filled page later. Shrinking still uses growproc. The accompanying changes in vm.c skip lazy holes and recover kernel-copy accesses; changing only this sbrk block would be incomplete. This corresponds to the MIT lazy-allocation exercise. </w:t>
+      </w:r>
+      <w:hyperlink r:id="rId13">
+        <w:r>
+          <w:rPr>
+            <w:color w:val="1D4ED8"/>
+            <w:u w:val="single"/>
+          </w:rPr>
+          <w:t>[R3]</w:t>
+        </w:r>
+      </w:hyperlink>
+      <w:r/>
+    </w:p>
+    <w:p>
+      <w:r>
+        <w:t>The observed baseline output changes from "baseline: sbrk(200MB) failed (expected on stock xv6)" to "baseline: sbrk(200MB) succeeded". Here the program's historical stock wording means the pinned eager checkpoint; reservation success is not 200 MiB of resident physical memory.</w:t>
+      </w:r>
+    </w:p>
+    <w:p>
+      <w:pPr>
+        <w:pStyle w:val="Heading1"/>
+      </w:pPr>
+      <w:r>
+        <w:t>Appendix B Exact fork and ownership changes</w:t>
+      </w:r>
+    </w:p>
+    <w:p>
+      <w:pPr>
+        <w:pStyle w:val="Heading2"/>
+      </w:pPr>
+      <w:r>
+        <w:t>Before: allocate and copy each mapped page</w:t>
+      </w:r>
+    </w:p>
+    <w:p>
+      <w:r>
+        <w:t xml:space="preserve">kernel/vm.c, uvmcopy(pagetable_t, 28c7475, lines 358-364. </w:t>
+      </w:r>
+      <w:hyperlink r:id="rId40">
+        <w:r>
+          <w:rPr>
+            <w:color w:val="1D4ED8"/>
+            <w:u w:val="single"/>
+          </w:rPr>
+          <w:t>[S3]</w:t>
+        </w:r>
+      </w:hyperlink>
+      <w:r/>
+    </w:p>
+    <w:p>
+      <w:pPr>
+        <w:spacing w:after="160" w:line="245" w:lineRule="auto"/>
+      </w:pPr>
+      <w:r>
+        <w:rPr>
+          <w:rFonts w:ascii="Consolas" w:hAnsi="Consolas"/>
+          <w:sz w:val="18"/>
+        </w:rPr>
+        <w:t xml:space="preserve">    if((mem = kalloc()) == 0)</w:t>
+      </w:r>
+      <w:r>
+        <w:br/>
+      </w:r>
+      <w:r>
+        <w:rPr>
+          <w:rFonts w:ascii="Consolas" w:hAnsi="Consolas"/>
+          <w:sz w:val="18"/>
+        </w:rPr>
+        <w:t xml:space="preserve">      goto err;</w:t>
+      </w:r>
+      <w:r>
+        <w:br/>
+      </w:r>
+      <w:r>
+        <w:rPr>
+          <w:rFonts w:ascii="Consolas" w:hAnsi="Consolas"/>
+          <w:sz w:val="18"/>
+        </w:rPr>
+        <w:t xml:space="preserve">    memmove(mem, (char*)pa, PGSIZE);</w:t>
+      </w:r>
+      <w:r>
+        <w:br/>
+      </w:r>
+      <w:r>
+        <w:rPr>
+          <w:rFonts w:ascii="Consolas" w:hAnsi="Consolas"/>
+          <w:sz w:val="18"/>
+        </w:rPr>
+        <w:t xml:space="preserve">    if(mappages(new, i, PGSIZE, (uint64)mem, flags) != 0){</w:t>
+      </w:r>
+      <w:r>
+        <w:br/>
+      </w:r>
+      <w:r>
+        <w:rPr>
+          <w:rFonts w:ascii="Consolas" w:hAnsi="Consolas"/>
+          <w:sz w:val="18"/>
+        </w:rPr>
+        <w:t xml:space="preserve">      kfree(mem);</w:t>
+      </w:r>
+      <w:r>
+        <w:br/>
+      </w:r>
+      <w:r>
+        <w:rPr>
+          <w:rFonts w:ascii="Consolas" w:hAnsi="Consolas"/>
+          <w:sz w:val="18"/>
+        </w:rPr>
+        <w:t xml:space="preserve">      goto err;</w:t>
+      </w:r>
+      <w:r>
+        <w:br/>
+      </w:r>
+      <w:r>
+        <w:rPr>
+          <w:rFonts w:ascii="Consolas" w:hAnsi="Consolas"/>
+          <w:sz w:val="18"/>
+        </w:rPr>
+        <w:t xml:space="preserve">    }</w:t>
+      </w:r>
+    </w:p>
+    <w:p>
+      <w:pPr>
+        <w:pStyle w:val="Heading2"/>
+      </w:pPr>
+      <w:r>
+        <w:t>After: map the same frame with COW protection</w:t>
+      </w:r>
+    </w:p>
+    <w:p>
+      <w:r>
+        <w:t xml:space="preserve">kernel/vm.c, uvmcopy(pagetable_t, v0.2, lines 359-370. </w:t>
+      </w:r>
+      <w:hyperlink r:id="rId41">
+        <w:r>
+          <w:rPr>
+            <w:color w:val="1D4ED8"/>
+            <w:u w:val="single"/>
+          </w:rPr>
+          <w:t>[S4]</w:t>
+        </w:r>
+      </w:hyperlink>
+      <w:r/>
+    </w:p>
+    <w:p>
+      <w:pPr>
+        <w:spacing w:after="160" w:line="245" w:lineRule="auto"/>
+      </w:pPr>
+      <w:r>
+        <w:rPr>
+          <w:rFonts w:ascii="Consolas" w:hAnsi="Consolas"/>
+          <w:sz w:val="18"/>
+        </w:rPr>
+        <w:t xml:space="preserve">    if(*pte &amp; PTE_W){</w:t>
+      </w:r>
+      <w:r>
+        <w:br/>
+      </w:r>
+      <w:r>
+        <w:rPr>
+          <w:rFonts w:ascii="Consolas" w:hAnsi="Consolas"/>
+          <w:sz w:val="18"/>
+        </w:rPr>
+        <w:t xml:space="preserve">      // Writable pages become COW in both processes.</w:t>
+      </w:r>
+      <w:r>
+        <w:br/>
+      </w:r>
+      <w:r>
+        <w:rPr>
+          <w:rFonts w:ascii="Consolas" w:hAnsi="Consolas"/>
+          <w:sz w:val="18"/>
+        </w:rPr>
+        <w:t xml:space="preserve">      *pte = (*pte &amp; ~PTE_W) | PTE_COW;</w:t>
+      </w:r>
+      <w:r>
+        <w:br/>
+      </w:r>
+      <w:r>
+        <w:rPr>
+          <w:rFonts w:ascii="Consolas" w:hAnsi="Consolas"/>
+          <w:sz w:val="18"/>
+        </w:rPr>
+        <w:t xml:space="preserve">    }</w:t>
+      </w:r>
+      <w:r>
+        <w:br/>
+      </w:r>
+      <w:r>
+        <w:rPr>
+          <w:rFonts w:ascii="Consolas" w:hAnsi="Consolas"/>
+          <w:sz w:val="18"/>
+        </w:rPr>
+      </w:r>
+      <w:r>
+        <w:br/>
+      </w:r>
+      <w:r>
+        <w:rPr>
+          <w:rFonts w:ascii="Consolas" w:hAnsi="Consolas"/>
+          <w:sz w:val="18"/>
+        </w:rPr>
+        <w:t xml:space="preserve">    flags = PTE_FLAGS(*pte);</w:t>
+      </w:r>
+      <w:r>
+        <w:br/>
+      </w:r>
+      <w:r>
+        <w:rPr>
+          <w:rFonts w:ascii="Consolas" w:hAnsi="Consolas"/>
+          <w:sz w:val="18"/>
+        </w:rPr>
+      </w:r>
+      <w:r>
+        <w:br/>
+      </w:r>
+      <w:r>
+        <w:rPr>
+          <w:rFonts w:ascii="Consolas" w:hAnsi="Consolas"/>
+          <w:sz w:val="18"/>
+        </w:rPr>
+        <w:t xml:space="preserve">    // Map the same physical page into the child.</w:t>
+      </w:r>
+      <w:r>
+        <w:br/>
+      </w:r>
+      <w:r>
+        <w:rPr>
+          <w:rFonts w:ascii="Consolas" w:hAnsi="Consolas"/>
+          <w:sz w:val="18"/>
+        </w:rPr>
+        <w:t xml:space="preserve">    if(mappages(new, i, PGSIZE, pa, flags) != 0)</w:t>
+      </w:r>
+      <w:r>
+        <w:br/>
+      </w:r>
+      <w:r>
+        <w:rPr>
+          <w:rFonts w:ascii="Consolas" w:hAnsi="Consolas"/>
+          <w:sz w:val="18"/>
+        </w:rPr>
+        <w:t xml:space="preserve">      goto err;</w:t>
+      </w:r>
+      <w:r>
+        <w:br/>
+      </w:r>
+      <w:r>
+        <w:rPr>
+          <w:rFonts w:ascii="Consolas" w:hAnsi="Consolas"/>
+          <w:sz w:val="18"/>
+        </w:rPr>
+      </w:r>
+      <w:r>
+        <w:br/>
+      </w:r>
+      <w:r>
+        <w:rPr>
+          <w:rFonts w:ascii="Consolas" w:hAnsi="Consolas"/>
+          <w:sz w:val="18"/>
+        </w:rPr>
+        <w:t xml:space="preserve">    kref_inc((void*)pa);</w:t>
+      </w:r>
+    </w:p>
+    <w:p>
+      <w:pPr>
+        <w:pStyle w:val="Heading2"/>
+      </w:pPr>
+      <w:r>
+        <w:t>Added last-owner release rule</w:t>
+      </w:r>
+    </w:p>
+    <w:p>
+      <w:r>
+        <w:t xml:space="preserve">kernel/kalloc.c, kfree(void *pa), v0.2, lines 67-70. </w:t>
+      </w:r>
+      <w:hyperlink r:id="rId42">
+        <w:r>
+          <w:rPr>
+            <w:color w:val="1D4ED8"/>
+            <w:u w:val="single"/>
+          </w:rPr>
+          <w:t>[S5]</w:t>
+        </w:r>
+      </w:hyperlink>
+      <w:r/>
+    </w:p>
+    <w:p>
+      <w:pPr>
+        <w:spacing w:after="160" w:line="245" w:lineRule="auto"/>
+      </w:pPr>
+      <w:r>
+        <w:rPr>
+          <w:rFonts w:ascii="Consolas" w:hAnsi="Consolas"/>
+          <w:sz w:val="18"/>
+        </w:rPr>
+        <w:t xml:space="preserve">  if(--pgref.count[PGIDX(pa)] &gt; 0){</w:t>
+      </w:r>
+      <w:r>
+        <w:br/>
+      </w:r>
+      <w:r>
+        <w:rPr>
+          <w:rFonts w:ascii="Consolas" w:hAnsi="Consolas"/>
+          <w:sz w:val="18"/>
+        </w:rPr>
+        <w:t xml:space="preserve">    release(&amp;pgref.lock);</w:t>
+      </w:r>
+      <w:r>
+        <w:br/>
+      </w:r>
+      <w:r>
+        <w:rPr>
+          <w:rFonts w:ascii="Consolas" w:hAnsi="Consolas"/>
+          <w:sz w:val="18"/>
+        </w:rPr>
+        <w:t xml:space="preserve">    return;</w:t>
+      </w:r>
+      <w:r>
+        <w:br/>
+      </w:r>
+      <w:r>
+        <w:rPr>
+          <w:rFonts w:ascii="Consolas" w:hAnsi="Consolas"/>
+          <w:sz w:val="18"/>
+        </w:rPr>
+        <w:t xml:space="preserve">  }</w:t>
+      </w:r>
+    </w:p>
+    <w:p>
+      <w:r>
+        <w:t xml:space="preserve">The old child mapping refers to newly copied data. The new mapping refers to pa itself; writable mappings are marked COW, references rise on sharing, and kfree returns early while another owner remains. The write-fault handler later copies a genuinely shared page or restores write permission for a sole owner. copyout uses the recovery path too. These are the ownership and kernel-copy concerns in the MIT COW lab. </w:t>
+      </w:r>
+      <w:hyperlink r:id="rId14">
+        <w:r>
+          <w:rPr>
+            <w:color w:val="1D4ED8"/>
+            <w:u w:val="single"/>
+          </w:rPr>
+          <w:t>[R4]</w:t>
+        </w:r>
+      </w:hyperlink>
+      <w:r/>
+    </w:p>
+    <w:p>
+      <w:r>
+        <w:t>The custom 80 MiB fork test changes from "cowtest: fork failed" to "cowtest: OK". It verifies selected child writes and parent isolation. The full fault handler, error cleanup and fencing remain in the linked sources; these excerpts alone are not a complete patch.</w:t>
+      </w:r>
+    </w:p>
+    <w:p>
+      <w:pPr>
+        <w:pStyle w:val="Heading1"/>
+      </w:pPr>
+      <w:r>
+        <w:t>Appendix C New memory-statistics interface</w:t>
+      </w:r>
+    </w:p>
+    <w:p>
+      <w:r>
+        <w:t>At v0.2, the project has no memstat header, syscall or user command. At v0.3 it adds the following interface and syscall wiring; syscall.h assigns number 22, syscall.c dispatches it, user.h declares it, usys.pl supplies the stub, and user/memstat.c prints the values.</w:t>
+      </w:r>
+    </w:p>
+    <w:p>
+      <w:pPr>
+        <w:pStyle w:val="Heading2"/>
+      </w:pPr>
+      <w:r>
+        <w:t>Added shared structure</w:t>
+      </w:r>
+    </w:p>
+    <w:p>
+      <w:r>
+        <w:t xml:space="preserve">kernel/memstat.h, struct memstat, v0.3, lines 4-12. </w:t>
+      </w:r>
+      <w:hyperlink r:id="rId43">
+        <w:r>
+          <w:rPr>
+            <w:color w:val="1D4ED8"/>
+            <w:u w:val="single"/>
+          </w:rPr>
+          <w:t>[S6]</w:t>
+        </w:r>
+      </w:hyperlink>
+      <w:r/>
+    </w:p>
+    <w:p>
+      <w:pPr>
+        <w:spacing w:after="160" w:line="245" w:lineRule="auto"/>
+      </w:pPr>
+      <w:r>
+        <w:rPr>
+          <w:rFonts w:ascii="Consolas" w:hAnsi="Consolas"/>
+          <w:sz w:val="18"/>
+        </w:rPr>
+        <w:t>struct memstat {</w:t>
+      </w:r>
+      <w:r>
+        <w:br/>
+      </w:r>
+      <w:r>
+        <w:rPr>
+          <w:rFonts w:ascii="Consolas" w:hAnsi="Consolas"/>
+          <w:sz w:val="18"/>
+        </w:rPr>
+        <w:t xml:space="preserve">  uint64 page_faults;</w:t>
+      </w:r>
+      <w:r>
+        <w:br/>
+      </w:r>
+      <w:r>
+        <w:rPr>
+          <w:rFonts w:ascii="Consolas" w:hAnsi="Consolas"/>
+          <w:sz w:val="18"/>
+        </w:rPr>
+        <w:t xml:space="preserve">  uint64 lazy_allocs;</w:t>
+      </w:r>
+      <w:r>
+        <w:br/>
+      </w:r>
+      <w:r>
+        <w:rPr>
+          <w:rFonts w:ascii="Consolas" w:hAnsi="Consolas"/>
+          <w:sz w:val="18"/>
+        </w:rPr>
+        <w:t xml:space="preserve">  uint64 cow_copies;</w:t>
+      </w:r>
+      <w:r>
+        <w:br/>
+      </w:r>
+      <w:r>
+        <w:rPr>
+          <w:rFonts w:ascii="Consolas" w:hAnsi="Consolas"/>
+          <w:sz w:val="18"/>
+        </w:rPr>
+        <w:t xml:space="preserve">  uint64 swap_outs;</w:t>
+      </w:r>
+      <w:r>
+        <w:br/>
+      </w:r>
+      <w:r>
+        <w:rPr>
+          <w:rFonts w:ascii="Consolas" w:hAnsi="Consolas"/>
+          <w:sz w:val="18"/>
+        </w:rPr>
+        <w:t xml:space="preserve">  uint64 swap_ins;</w:t>
+      </w:r>
+      <w:r>
+        <w:br/>
+      </w:r>
+      <w:r>
+        <w:rPr>
+          <w:rFonts w:ascii="Consolas" w:hAnsi="Consolas"/>
+          <w:sz w:val="18"/>
+        </w:rPr>
+        <w:t xml:space="preserve">  uint64 free_pages;</w:t>
+      </w:r>
+      <w:r>
+        <w:br/>
+      </w:r>
+      <w:r>
+        <w:rPr>
+          <w:rFonts w:ascii="Consolas" w:hAnsi="Consolas"/>
+          <w:sz w:val="18"/>
+        </w:rPr>
+        <w:t xml:space="preserve">  uint64 swap_slots_used;</w:t>
+      </w:r>
+      <w:r>
+        <w:br/>
+      </w:r>
+      <w:r>
+        <w:rPr>
+          <w:rFonts w:ascii="Consolas" w:hAnsi="Consolas"/>
+          <w:sz w:val="18"/>
+        </w:rPr>
+        <w:t>};</w:t>
+      </w:r>
+    </w:p>
+    <w:p>
+      <w:pPr>
+        <w:pStyle w:val="Heading2"/>
+      </w:pPr>
+      <w:r>
+        <w:t>Added syscall copy to the user's buffer</w:t>
+      </w:r>
+    </w:p>
+    <w:p>
+      <w:r>
+        <w:t xml:space="preserve">kernel/sysproc.c, sys_memstat(void), v0.3, lines 112-119. </w:t>
+      </w:r>
+      <w:hyperlink r:id="rId44">
+        <w:r>
+          <w:rPr>
+            <w:color w:val="1D4ED8"/>
+            <w:u w:val="single"/>
+          </w:rPr>
+          <w:t>[S7]</w:t>
+        </w:r>
+      </w:hyperlink>
+      <w:r/>
+    </w:p>
+    <w:p>
+      <w:pPr>
+        <w:spacing w:after="160" w:line="245" w:lineRule="auto"/>
+      </w:pPr>
+      <w:r>
+        <w:rPr>
+          <w:rFonts w:ascii="Consolas" w:hAnsi="Consolas"/>
+          <w:sz w:val="18"/>
+        </w:rPr>
+        <w:t xml:space="preserve">  argaddr(0, &amp;addr);</w:t>
+      </w:r>
+      <w:r>
+        <w:br/>
+      </w:r>
+      <w:r>
+        <w:rPr>
+          <w:rFonts w:ascii="Consolas" w:hAnsi="Consolas"/>
+          <w:sz w:val="18"/>
+        </w:rPr>
+        <w:t xml:space="preserve">  memstat_fill(&amp;ms);</w:t>
+      </w:r>
+      <w:r>
+        <w:br/>
+      </w:r>
+      <w:r>
+        <w:rPr>
+          <w:rFonts w:ascii="Consolas" w:hAnsi="Consolas"/>
+          <w:sz w:val="18"/>
+        </w:rPr>
+      </w:r>
+      <w:r>
+        <w:br/>
+      </w:r>
+      <w:r>
+        <w:rPr>
+          <w:rFonts w:ascii="Consolas" w:hAnsi="Consolas"/>
+          <w:sz w:val="18"/>
+        </w:rPr>
+        <w:t xml:space="preserve">  if(copyout(myproc()-&gt;pagetable, addr,</w:t>
+      </w:r>
+      <w:r>
+        <w:br/>
+      </w:r>
+      <w:r>
+        <w:rPr>
+          <w:rFonts w:ascii="Consolas" w:hAnsi="Consolas"/>
+          <w:sz w:val="18"/>
+        </w:rPr>
+        <w:t xml:space="preserve">             (char*)&amp;ms, sizeof(ms)) &lt; 0)</w:t>
+      </w:r>
+      <w:r>
+        <w:br/>
+      </w:r>
+      <w:r>
+        <w:rPr>
+          <w:rFonts w:ascii="Consolas" w:hAnsi="Consolas"/>
+          <w:sz w:val="18"/>
+        </w:rPr>
+        <w:t xml:space="preserve">    return -1;</w:t>
+      </w:r>
+      <w:r>
+        <w:br/>
+      </w:r>
+      <w:r>
+        <w:rPr>
+          <w:rFonts w:ascii="Consolas" w:hAnsi="Consolas"/>
+          <w:sz w:val="18"/>
+        </w:rPr>
+      </w:r>
+      <w:r>
+        <w:br/>
+      </w:r>
+      <w:r>
+        <w:rPr>
+          <w:rFonts w:ascii="Consolas" w:hAnsi="Consolas"/>
+          <w:sz w:val="18"/>
+        </w:rPr>
+        <w:t xml:space="preserve">  return 0;</w:t>
+      </w:r>
+    </w:p>
+    <w:tbl>
+      <w:tblPr>
+        <w:tblW w:type="dxa" w:w="10080"/>
+        <w:jc w:val="center"/>
+        <w:tblLayout w:type="fixed"/>
+        <w:tblLook w:firstColumn="1" w:firstRow="1" w:lastColumn="0" w:lastRow="0" w:noHBand="0" w:noVBand="1" w:val="04A0"/>
+      </w:tblPr>
+      <w:tblGrid>
+        <w:gridCol w:w="3744"/>
+        <w:gridCol w:w="3168"/>
+        <w:gridCol w:w="3168"/>
+      </w:tblGrid>
+      <w:tr>
+        <w:trPr>
+          <w:cantSplit/>
+          <w:tblHeader/>
+        </w:trPr>
+        <w:tc>
+          <w:tcPr>
+            <w:tcW w:type="dxa" w:w="3744"/>
+            <w:vAlign w:val="center"/>
+            <w:tcMar>
+              <w:top w:w="85" w:type="dxa"/>
+              <w:bottom w:w="85" w:type="dxa"/>
+              <w:left w:w="85" w:type="dxa"/>
+              <w:right w:w="85" w:type="dxa"/>
+            </w:tcMar>
+            <w:shd w:fill="DFE8EF"/>
+            <w:tcBorders>
+              <w:top w:val="single" w:sz="4" w:color="D9D9D9"/>
+              <w:bottom w:val="single" w:sz="4" w:color="D9D9D9"/>
+              <w:left w:val="single" w:sz="4" w:color="D9D9D9"/>
+              <w:right w:val="single" w:sz="4" w:color="D9D9D9"/>
+            </w:tcBorders>
+          </w:tcPr>
+          <w:p>
+            <w:pPr>
+              <w:spacing w:before="40" w:after="60" w:line="245" w:lineRule="auto"/>
+            </w:pPr>
+            <w:r>
+              <w:rPr>
+                <w:b/>
+                <w:sz w:val="19"/>
+              </w:rPr>
+              <w:t>Recorded v0.3 field</w:t>
+            </w:r>
+          </w:p>
+        </w:tc>
+        <w:tc>
+          <w:tcPr>
+            <w:tcW w:type="dxa" w:w="3168"/>
+            <w:vAlign w:val="center"/>
+            <w:tcMar>
+              <w:top w:w="85" w:type="dxa"/>
+              <w:bottom w:w="85" w:type="dxa"/>
+              <w:left w:w="85" w:type="dxa"/>
+              <w:right w:w="85" w:type="dxa"/>
+            </w:tcMar>
+            <w:shd w:fill="DFE8EF"/>
+            <w:tcBorders>
+              <w:top w:val="single" w:sz="4" w:color="D9D9D9"/>
+              <w:bottom w:val="single" w:sz="4" w:color="D9D9D9"/>
+              <w:left w:val="single" w:sz="4" w:color="D9D9D9"/>
+              <w:right w:val="single" w:sz="4" w:color="D9D9D9"/>
+            </w:tcBorders>
+          </w:tcPr>
+          <w:p>
+            <w:pPr>
+              <w:spacing w:before="40" w:after="60" w:line="245" w:lineRule="auto"/>
+            </w:pPr>
+            <w:r>
+              <w:rPr>
+                <w:b/>
+                <w:sz w:val="19"/>
+              </w:rPr>
+              <w:t>Initial memstat</w:t>
+            </w:r>
+          </w:p>
+        </w:tc>
+        <w:tc>
+          <w:tcPr>
+            <w:tcW w:type="dxa" w:w="3168"/>
+            <w:vAlign w:val="center"/>
+            <w:tcMar>
+              <w:top w:w="85" w:type="dxa"/>
+              <w:bottom w:w="85" w:type="dxa"/>
+              <w:left w:w="85" w:type="dxa"/>
+              <w:right w:w="85" w:type="dxa"/>
+            </w:tcMar>
+            <w:shd w:fill="DFE8EF"/>
+            <w:tcBorders>
+              <w:top w:val="single" w:sz="4" w:color="D9D9D9"/>
+              <w:bottom w:val="single" w:sz="4" w:color="D9D9D9"/>
+              <w:left w:val="single" w:sz="4" w:color="D9D9D9"/>
+              <w:right w:val="single" w:sz="4" w:color="D9D9D9"/>
+            </w:tcBorders>
+          </w:tcPr>
+          <w:p>
+            <w:pPr>
+              <w:spacing w:before="40" w:after="60" w:line="245" w:lineRule="auto"/>
+            </w:pPr>
+            <w:r>
+              <w:rPr>
+                <w:b/>
+                <w:sz w:val="19"/>
+              </w:rPr>
+              <w:t>After cowtest</w:t>
+            </w:r>
+          </w:p>
+        </w:tc>
+      </w:tr>
+      <w:tr>
+        <w:trPr>
+          <w:cantSplit/>
+        </w:trPr>
+        <w:tc>
+          <w:tcPr>
+            <w:tcW w:type="dxa" w:w="3744"/>
+            <w:vAlign w:val="center"/>
+            <w:tcMar>
+              <w:top w:w="85" w:type="dxa"/>
+              <w:bottom w:w="85" w:type="dxa"/>
+              <w:left w:w="85" w:type="dxa"/>
+              <w:right w:w="85" w:type="dxa"/>
+            </w:tcMar>
+            <w:shd w:fill="FFFFFF"/>
+            <w:tcBorders>
+              <w:top w:val="single" w:sz="4" w:color="D9D9D9"/>
+              <w:bottom w:val="single" w:sz="4" w:color="D9D9D9"/>
+              <w:left w:val="single" w:sz="4" w:color="D9D9D9"/>
+              <w:right w:val="single" w:sz="4" w:color="D9D9D9"/>
+            </w:tcBorders>
+          </w:tcPr>
+          <w:p>
+            <w:pPr>
+              <w:spacing w:before="40" w:after="60" w:line="245" w:lineRule="auto"/>
+            </w:pPr>
+            <w:r>
+              <w:rPr>
+                <w:b w:val="0"/>
+                <w:sz w:val="19"/>
+              </w:rPr>
+              <w:t>page faults</w:t>
+            </w:r>
+          </w:p>
+        </w:tc>
+        <w:tc>
+          <w:tcPr>
+            <w:tcW w:type="dxa" w:w="3168"/>
+            <w:vAlign w:val="center"/>
+            <w:tcMar>
+              <w:top w:w="85" w:type="dxa"/>
+              <w:bottom w:w="85" w:type="dxa"/>
+              <w:left w:w="85" w:type="dxa"/>
+              <w:right w:w="85" w:type="dxa"/>
+            </w:tcMar>
+            <w:shd w:fill="FFFFFF"/>
+            <w:tcBorders>
+              <w:top w:val="single" w:sz="4" w:color="D9D9D9"/>
+              <w:bottom w:val="single" w:sz="4" w:color="D9D9D9"/>
+              <w:left w:val="single" w:sz="4" w:color="D9D9D9"/>
+              <w:right w:val="single" w:sz="4" w:color="D9D9D9"/>
+            </w:tcBorders>
+          </w:tcPr>
+          <w:p>
+            <w:pPr>
+              <w:spacing w:before="40" w:after="60" w:line="245" w:lineRule="auto"/>
+            </w:pPr>
+            <w:r>
+              <w:rPr>
+                <w:b w:val="0"/>
+                <w:sz w:val="19"/>
+              </w:rPr>
+              <w:t>4</w:t>
+            </w:r>
+          </w:p>
+        </w:tc>
+        <w:tc>
+          <w:tcPr>
+            <w:tcW w:type="dxa" w:w="3168"/>
+            <w:vAlign w:val="center"/>
+            <w:tcMar>
+              <w:top w:w="85" w:type="dxa"/>
+              <w:bottom w:w="85" w:type="dxa"/>
+              <w:left w:w="85" w:type="dxa"/>
+              <w:right w:w="85" w:type="dxa"/>
+            </w:tcMar>
+            <w:shd w:fill="FFFFFF"/>
+            <w:tcBorders>
+              <w:top w:val="single" w:sz="4" w:color="D9D9D9"/>
+              <w:bottom w:val="single" w:sz="4" w:color="D9D9D9"/>
+              <w:left w:val="single" w:sz="4" w:color="D9D9D9"/>
+              <w:right w:val="single" w:sz="4" w:color="D9D9D9"/>
+            </w:tcBorders>
+          </w:tcPr>
+          <w:p>
+            <w:pPr>
+              <w:spacing w:before="40" w:after="60" w:line="245" w:lineRule="auto"/>
+            </w:pPr>
+            <w:r>
+              <w:rPr>
+                <w:b w:val="0"/>
+                <w:sz w:val="19"/>
+              </w:rPr>
+              <w:t>20518</w:t>
+            </w:r>
+          </w:p>
+        </w:tc>
+      </w:tr>
+      <w:tr>
+        <w:trPr>
+          <w:cantSplit/>
+        </w:trPr>
+        <w:tc>
+          <w:tcPr>
+            <w:tcW w:type="dxa" w:w="3744"/>
+            <w:vAlign w:val="center"/>
+            <w:tcMar>
+              <w:top w:w="85" w:type="dxa"/>
+              <w:bottom w:w="85" w:type="dxa"/>
+              <w:left w:w="85" w:type="dxa"/>
+              <w:right w:w="85" w:type="dxa"/>
+            </w:tcMar>
+            <w:shd w:fill="F5F7F9"/>
+            <w:tcBorders>
+              <w:top w:val="single" w:sz="4" w:color="D9D9D9"/>
+              <w:bottom w:val="single" w:sz="4" w:color="D9D9D9"/>
+              <w:left w:val="single" w:sz="4" w:color="D9D9D9"/>
+              <w:right w:val="single" w:sz="4" w:color="D9D9D9"/>
+            </w:tcBorders>
+          </w:tcPr>
+          <w:p>
+            <w:pPr>
+              <w:spacing w:before="40" w:after="60" w:line="245" w:lineRule="auto"/>
+            </w:pPr>
+            <w:r>
+              <w:rPr>
+                <w:b w:val="0"/>
+                <w:sz w:val="19"/>
+              </w:rPr>
+              <w:t>lazy allocations</w:t>
+            </w:r>
+          </w:p>
+        </w:tc>
+        <w:tc>
+          <w:tcPr>
+            <w:tcW w:type="dxa" w:w="3168"/>
+            <w:vAlign w:val="center"/>
+            <w:tcMar>
+              <w:top w:w="85" w:type="dxa"/>
+              <w:bottom w:w="85" w:type="dxa"/>
+              <w:left w:w="85" w:type="dxa"/>
+              <w:right w:w="85" w:type="dxa"/>
+            </w:tcMar>
+            <w:shd w:fill="F5F7F9"/>
+            <w:tcBorders>
+              <w:top w:val="single" w:sz="4" w:color="D9D9D9"/>
+              <w:bottom w:val="single" w:sz="4" w:color="D9D9D9"/>
+              <w:left w:val="single" w:sz="4" w:color="D9D9D9"/>
+              <w:right w:val="single" w:sz="4" w:color="D9D9D9"/>
+            </w:tcBorders>
+          </w:tcPr>
+          <w:p>
+            <w:pPr>
+              <w:spacing w:before="40" w:after="60" w:line="245" w:lineRule="auto"/>
+            </w:pPr>
+            <w:r>
+              <w:rPr>
+                <w:b w:val="0"/>
+                <w:sz w:val="19"/>
+              </w:rPr>
+              <w:t>2</w:t>
+            </w:r>
+          </w:p>
+        </w:tc>
+        <w:tc>
+          <w:tcPr>
+            <w:tcW w:type="dxa" w:w="3168"/>
+            <w:vAlign w:val="center"/>
+            <w:tcMar>
+              <w:top w:w="85" w:type="dxa"/>
+              <w:bottom w:w="85" w:type="dxa"/>
+              <w:left w:w="85" w:type="dxa"/>
+              <w:right w:w="85" w:type="dxa"/>
+            </w:tcMar>
+            <w:shd w:fill="F5F7F9"/>
+            <w:tcBorders>
+              <w:top w:val="single" w:sz="4" w:color="D9D9D9"/>
+              <w:bottom w:val="single" w:sz="4" w:color="D9D9D9"/>
+              <w:left w:val="single" w:sz="4" w:color="D9D9D9"/>
+              <w:right w:val="single" w:sz="4" w:color="D9D9D9"/>
+            </w:tcBorders>
+          </w:tcPr>
+          <w:p>
+            <w:pPr>
+              <w:spacing w:before="40" w:after="60" w:line="245" w:lineRule="auto"/>
+            </w:pPr>
+            <w:r>
+              <w:rPr>
+                <w:b w:val="0"/>
+                <w:sz w:val="19"/>
+              </w:rPr>
+              <w:t>20486</w:t>
+            </w:r>
+          </w:p>
+        </w:tc>
+      </w:tr>
+      <w:tr>
+        <w:trPr>
+          <w:cantSplit/>
+        </w:trPr>
+        <w:tc>
+          <w:tcPr>
+            <w:tcW w:type="dxa" w:w="3744"/>
+            <w:vAlign w:val="center"/>
+            <w:tcMar>
+              <w:top w:w="85" w:type="dxa"/>
+              <w:bottom w:w="85" w:type="dxa"/>
+              <w:left w:w="85" w:type="dxa"/>
+              <w:right w:w="85" w:type="dxa"/>
+            </w:tcMar>
+            <w:shd w:fill="FFFFFF"/>
+            <w:tcBorders>
+              <w:top w:val="single" w:sz="4" w:color="D9D9D9"/>
+              <w:bottom w:val="single" w:sz="4" w:color="D9D9D9"/>
+              <w:left w:val="single" w:sz="4" w:color="D9D9D9"/>
+              <w:right w:val="single" w:sz="4" w:color="D9D9D9"/>
+            </w:tcBorders>
+          </w:tcPr>
+          <w:p>
+            <w:pPr>
+              <w:spacing w:before="40" w:after="60" w:line="245" w:lineRule="auto"/>
+            </w:pPr>
+            <w:r>
+              <w:rPr>
+                <w:b w:val="0"/>
+                <w:sz w:val="19"/>
+              </w:rPr>
+              <w:t>COW copies</w:t>
+            </w:r>
+          </w:p>
+        </w:tc>
+        <w:tc>
+          <w:tcPr>
+            <w:tcW w:type="dxa" w:w="3168"/>
+            <w:vAlign w:val="center"/>
+            <w:tcMar>
+              <w:top w:w="85" w:type="dxa"/>
+              <w:bottom w:w="85" w:type="dxa"/>
+              <w:left w:w="85" w:type="dxa"/>
+              <w:right w:w="85" w:type="dxa"/>
+            </w:tcMar>
+            <w:shd w:fill="FFFFFF"/>
+            <w:tcBorders>
+              <w:top w:val="single" w:sz="4" w:color="D9D9D9"/>
+              <w:bottom w:val="single" w:sz="4" w:color="D9D9D9"/>
+              <w:left w:val="single" w:sz="4" w:color="D9D9D9"/>
+              <w:right w:val="single" w:sz="4" w:color="D9D9D9"/>
+            </w:tcBorders>
+          </w:tcPr>
+          <w:p>
+            <w:pPr>
+              <w:spacing w:before="40" w:after="60" w:line="245" w:lineRule="auto"/>
+            </w:pPr>
+            <w:r>
+              <w:rPr>
+                <w:b w:val="0"/>
+                <w:sz w:val="19"/>
+              </w:rPr>
+              <w:t>2</w:t>
+            </w:r>
+          </w:p>
+        </w:tc>
+        <w:tc>
+          <w:tcPr>
+            <w:tcW w:type="dxa" w:w="3168"/>
+            <w:vAlign w:val="center"/>
+            <w:tcMar>
+              <w:top w:w="85" w:type="dxa"/>
+              <w:bottom w:w="85" w:type="dxa"/>
+              <w:left w:w="85" w:type="dxa"/>
+              <w:right w:w="85" w:type="dxa"/>
+            </w:tcMar>
+            <w:shd w:fill="FFFFFF"/>
+            <w:tcBorders>
+              <w:top w:val="single" w:sz="4" w:color="D9D9D9"/>
+              <w:bottom w:val="single" w:sz="4" w:color="D9D9D9"/>
+              <w:left w:val="single" w:sz="4" w:color="D9D9D9"/>
+              <w:right w:val="single" w:sz="4" w:color="D9D9D9"/>
+            </w:tcBorders>
+          </w:tcPr>
+          <w:p>
+            <w:pPr>
+              <w:spacing w:before="40" w:after="60" w:line="245" w:lineRule="auto"/>
+            </w:pPr>
+            <w:r>
+              <w:rPr>
+                <w:b w:val="0"/>
+                <w:sz w:val="19"/>
+              </w:rPr>
+              <w:t>27</w:t>
+            </w:r>
+          </w:p>
+        </w:tc>
+      </w:tr>
+      <w:tr>
+        <w:trPr>
+          <w:cantSplit/>
+        </w:trPr>
+        <w:tc>
+          <w:tcPr>
+            <w:tcW w:type="dxa" w:w="3744"/>
+            <w:vAlign w:val="center"/>
+            <w:tcMar>
+              <w:top w:w="85" w:type="dxa"/>
+              <w:bottom w:w="85" w:type="dxa"/>
+              <w:left w:w="85" w:type="dxa"/>
+              <w:right w:w="85" w:type="dxa"/>
+            </w:tcMar>
+            <w:shd w:fill="F5F7F9"/>
+            <w:tcBorders>
+              <w:top w:val="single" w:sz="4" w:color="D9D9D9"/>
+              <w:bottom w:val="single" w:sz="4" w:color="D9D9D9"/>
+              <w:left w:val="single" w:sz="4" w:color="D9D9D9"/>
+              <w:right w:val="single" w:sz="4" w:color="D9D9D9"/>
+            </w:tcBorders>
+          </w:tcPr>
+          <w:p>
+            <w:pPr>
+              <w:spacing w:before="40" w:after="60" w:line="245" w:lineRule="auto"/>
+            </w:pPr>
+            <w:r>
+              <w:rPr>
+                <w:b w:val="0"/>
+                <w:sz w:val="19"/>
+              </w:rPr>
+              <w:t>free pages</w:t>
+            </w:r>
+          </w:p>
+        </w:tc>
+        <w:tc>
+          <w:tcPr>
+            <w:tcW w:type="dxa" w:w="3168"/>
+            <w:vAlign w:val="center"/>
+            <w:tcMar>
+              <w:top w:w="85" w:type="dxa"/>
+              <w:bottom w:w="85" w:type="dxa"/>
+              <w:left w:w="85" w:type="dxa"/>
+              <w:right w:w="85" w:type="dxa"/>
+            </w:tcMar>
+            <w:shd w:fill="F5F7F9"/>
+            <w:tcBorders>
+              <w:top w:val="single" w:sz="4" w:color="D9D9D9"/>
+              <w:bottom w:val="single" w:sz="4" w:color="D9D9D9"/>
+              <w:left w:val="single" w:sz="4" w:color="D9D9D9"/>
+              <w:right w:val="single" w:sz="4" w:color="D9D9D9"/>
+            </w:tcBorders>
+          </w:tcPr>
+          <w:p>
+            <w:pPr>
+              <w:spacing w:before="40" w:after="60" w:line="245" w:lineRule="auto"/>
+            </w:pPr>
+            <w:r>
+              <w:rPr>
+                <w:b w:val="0"/>
+                <w:sz w:val="19"/>
+              </w:rPr>
+              <w:t>32500</w:t>
+            </w:r>
+          </w:p>
+        </w:tc>
+        <w:tc>
+          <w:tcPr>
+            <w:tcW w:type="dxa" w:w="3168"/>
+            <w:vAlign w:val="center"/>
+            <w:tcMar>
+              <w:top w:w="85" w:type="dxa"/>
+              <w:bottom w:w="85" w:type="dxa"/>
+              <w:left w:w="85" w:type="dxa"/>
+              <w:right w:w="85" w:type="dxa"/>
+            </w:tcMar>
+            <w:shd w:fill="F5F7F9"/>
+            <w:tcBorders>
+              <w:top w:val="single" w:sz="4" w:color="D9D9D9"/>
+              <w:bottom w:val="single" w:sz="4" w:color="D9D9D9"/>
+              <w:left w:val="single" w:sz="4" w:color="D9D9D9"/>
+              <w:right w:val="single" w:sz="4" w:color="D9D9D9"/>
+            </w:tcBorders>
+          </w:tcPr>
+          <w:p>
+            <w:pPr>
+              <w:spacing w:before="40" w:after="60" w:line="245" w:lineRule="auto"/>
+            </w:pPr>
+            <w:r>
+              <w:rPr>
+                <w:b w:val="0"/>
+                <w:sz w:val="19"/>
+              </w:rPr>
+              <w:t>32500</w:t>
+            </w:r>
+          </w:p>
+        </w:tc>
+      </w:tr>
+    </w:tbl>
+    <w:p>
+      <w:pPr>
+        <w:spacing w:line="20" w:lineRule="exact" w:after="60"/>
+      </w:pPr>
+    </w:p>
+    <w:p>
+      <w:r>
+        <w:t xml:space="preserve">This is a before/after workload observation within the same v0.3 boot, not a nonexistent old memstat measurement. The new functionality is visibility into memory events and current resources. Counts include shell and measurement activity. MIT's sysinfo exercise is a related interface reference; our structure and seven-field meaning differ. </w:t>
+      </w:r>
+      <w:hyperlink r:id="rId15">
+        <w:r>
+          <w:rPr>
+            <w:color w:val="1D4ED8"/>
+            <w:u w:val="single"/>
+          </w:rPr>
+          <w:t>[R5]</w:t>
+        </w:r>
+      </w:hyperlink>
+      <w:r/>
+    </w:p>
+    <w:p>
+      <w:pPr>
+        <w:pStyle w:val="Heading1"/>
+      </w:pPr>
+      <w:r>
+        <w:t>Appendix D Exact swap recovery additions</w:t>
+      </w:r>
+    </w:p>
+    <w:p>
+      <w:r>
+        <w:t>Before-swap already includes lazy allocation, COW and a swap.c statistics stub, whose slots-used value is zero. It has no disk eviction/restore engine. When the required physical frame cannot be allocated, the lazy recovery path returns failure.</w:t>
+      </w:r>
+    </w:p>
+    <w:p>
+      <w:pPr>
+        <w:pStyle w:val="Heading2"/>
+      </w:pPr>
+      <w:r>
+        <w:t>Before: no frame available</w:t>
+      </w:r>
+    </w:p>
+    <w:p>
+      <w:r>
+        <w:t xml:space="preserve">kernel/pgfault.c, handle_page_fault(, before-swap, lines 22-25. </w:t>
+      </w:r>
+      <w:hyperlink r:id="rId45">
+        <w:r>
+          <w:rPr>
+            <w:color w:val="1D4ED8"/>
+            <w:u w:val="single"/>
+          </w:rPr>
+          <w:t>[S8]</w:t>
+        </w:r>
+      </w:hyperlink>
+      <w:r/>
+    </w:p>
+    <w:p>
+      <w:pPr>
+        <w:spacing w:after="160" w:line="245" w:lineRule="auto"/>
+      </w:pPr>
+      <w:r>
+        <w:rPr>
+          <w:rFonts w:ascii="Consolas" w:hAnsi="Consolas"/>
+          <w:sz w:val="18"/>
+        </w:rPr>
+        <w:t xml:space="preserve">    char *mem = kalloc();</w:t>
+      </w:r>
+      <w:r>
+        <w:br/>
+      </w:r>
+      <w:r>
+        <w:rPr>
+          <w:rFonts w:ascii="Consolas" w:hAnsi="Consolas"/>
+          <w:sz w:val="18"/>
+        </w:rPr>
+      </w:r>
+      <w:r>
+        <w:br/>
+      </w:r>
+      <w:r>
+        <w:rPr>
+          <w:rFonts w:ascii="Consolas" w:hAnsi="Consolas"/>
+          <w:sz w:val="18"/>
+        </w:rPr>
+        <w:t xml:space="preserve">    if(mem == 0)</w:t>
+      </w:r>
+      <w:r>
+        <w:br/>
+      </w:r>
+      <w:r>
+        <w:rPr>
+          <w:rFonts w:ascii="Consolas" w:hAnsi="Consolas"/>
+          <w:sz w:val="18"/>
+        </w:rPr>
+        <w:t xml:space="preserve">      return -1;</w:t>
+      </w:r>
+    </w:p>
+    <w:p>
+      <w:pPr>
+        <w:pStyle w:val="Heading2"/>
+      </w:pPr>
+      <w:r>
+        <w:t>After: preserve an eligible page in a disk slot</w:t>
+      </w:r>
+    </w:p>
+    <w:p>
+      <w:r>
+        <w:t xml:space="preserve">kernel/swap.c, swap_out_one(void), v0.4, lines 260-274. </w:t>
+      </w:r>
+      <w:hyperlink r:id="rId46">
+        <w:r>
+          <w:rPr>
+            <w:color w:val="1D4ED8"/>
+            <w:u w:val="single"/>
+          </w:rPr>
+          <w:t>[S9]</w:t>
+        </w:r>
+      </w:hyperlink>
+      <w:r/>
+    </w:p>
+    <w:p>
+      <w:pPr>
+        <w:spacing w:after="160" w:line="245" w:lineRule="auto"/>
+      </w:pPr>
+      <w:r>
+        <w:rPr>
+          <w:rFonts w:ascii="Consolas" w:hAnsi="Consolas"/>
+          <w:sz w:val="18"/>
+        </w:rPr>
+        <w:t xml:space="preserve">      *pte = SLOT2PTE(slot) | PTE_SWAP | perm;</w:t>
+      </w:r>
+      <w:r>
+        <w:br/>
+      </w:r>
+      <w:r>
+        <w:rPr>
+          <w:rFonts w:ascii="Consolas" w:hAnsi="Consolas"/>
+          <w:sz w:val="18"/>
+        </w:rPr>
+        <w:t xml:space="preserve">      sfence_vma();</w:t>
+      </w:r>
+      <w:r>
+        <w:br/>
+      </w:r>
+      <w:r>
+        <w:rPr>
+          <w:rFonts w:ascii="Consolas" w:hAnsi="Consolas"/>
+          <w:sz w:val="18"/>
+        </w:rPr>
+      </w:r>
+      <w:r>
+        <w:br/>
+      </w:r>
+      <w:r>
+        <w:rPr>
+          <w:rFonts w:ascii="Consolas" w:hAnsi="Consolas"/>
+          <w:sz w:val="18"/>
+        </w:rPr>
+        <w:t xml:space="preserve">      frames[i].pt = 0;</w:t>
+      </w:r>
+      <w:r>
+        <w:br/>
+      </w:r>
+      <w:r>
+        <w:rPr>
+          <w:rFonts w:ascii="Consolas" w:hAnsi="Consolas"/>
+          <w:sz w:val="18"/>
+        </w:rPr>
+        <w:t xml:space="preserve">    }</w:t>
+      </w:r>
+      <w:r>
+        <w:br/>
+      </w:r>
+      <w:r>
+        <w:rPr>
+          <w:rFonts w:ascii="Consolas" w:hAnsi="Consolas"/>
+          <w:sz w:val="18"/>
+        </w:rPr>
+        <w:t xml:space="preserve">  }</w:t>
+      </w:r>
+      <w:r>
+        <w:br/>
+      </w:r>
+      <w:r>
+        <w:rPr>
+          <w:rFonts w:ascii="Consolas" w:hAnsi="Consolas"/>
+          <w:sz w:val="18"/>
+        </w:rPr>
+      </w:r>
+      <w:r>
+        <w:br/>
+      </w:r>
+      <w:r>
+        <w:rPr>
+          <w:rFonts w:ascii="Consolas" w:hAnsi="Consolas"/>
+          <w:sz w:val="18"/>
+        </w:rPr>
+        <w:t xml:space="preserve">  pop_off();</w:t>
+      </w:r>
+      <w:r>
+        <w:br/>
+      </w:r>
+      <w:r>
+        <w:rPr>
+          <w:rFonts w:ascii="Consolas" w:hAnsi="Consolas"/>
+          <w:sz w:val="18"/>
+        </w:rPr>
+      </w:r>
+      <w:r>
+        <w:br/>
+      </w:r>
+      <w:r>
+        <w:rPr>
+          <w:rFonts w:ascii="Consolas" w:hAnsi="Consolas"/>
+          <w:sz w:val="18"/>
+        </w:rPr>
+        <w:t xml:space="preserve">  if(i &gt;= 0 &amp;&amp; slot &gt;= 0){</w:t>
+      </w:r>
+      <w:r>
+        <w:br/>
+      </w:r>
+      <w:r>
+        <w:rPr>
+          <w:rFonts w:ascii="Consolas" w:hAnsi="Consolas"/>
+          <w:sz w:val="18"/>
+        </w:rPr>
+        <w:t xml:space="preserve">    swap_write(slot, pa);</w:t>
+      </w:r>
+      <w:r>
+        <w:br/>
+      </w:r>
+      <w:r>
+        <w:rPr>
+          <w:rFonts w:ascii="Consolas" w:hAnsi="Consolas"/>
+          <w:sz w:val="18"/>
+        </w:rPr>
+        <w:t xml:space="preserve">    kfree((void *)pa);</w:t>
+      </w:r>
+      <w:r>
+        <w:br/>
+      </w:r>
+      <w:r>
+        <w:rPr>
+          <w:rFonts w:ascii="Consolas" w:hAnsi="Consolas"/>
+          <w:sz w:val="18"/>
+        </w:rPr>
+        <w:t xml:space="preserve">    stat_swapout++;</w:t>
+      </w:r>
+      <w:r>
+        <w:br/>
+      </w:r>
+      <w:r>
+        <w:rPr>
+          <w:rFonts w:ascii="Consolas" w:hAnsi="Consolas"/>
+          <w:sz w:val="18"/>
+        </w:rPr>
+        <w:t xml:space="preserve">    ret = 0;</w:t>
+      </w:r>
+      <w:r>
+        <w:br/>
+      </w:r>
+      <w:r>
+        <w:rPr>
+          <w:rFonts w:ascii="Consolas" w:hAnsi="Consolas"/>
+          <w:sz w:val="18"/>
+        </w:rPr>
+        <w:t xml:space="preserve">  }</w:t>
+      </w:r>
+    </w:p>
+    <w:p>
+      <w:pPr>
+        <w:pStyle w:val="Heading2"/>
+      </w:pPr>
+      <w:r>
+        <w:t>After: restore its bytes and release the slot</w:t>
+      </w:r>
+    </w:p>
+    <w:p>
+      <w:r>
+        <w:t xml:space="preserve">kernel/swap.c, swap_in(pagetable_t, v0.4, lines 299-305. </w:t>
+      </w:r>
+      <w:hyperlink r:id="rId47">
+        <w:r>
+          <w:rPr>
+            <w:color w:val="1D4ED8"/>
+            <w:u w:val="single"/>
+          </w:rPr>
+          <w:t>[S10]</w:t>
+        </w:r>
+      </w:hyperlink>
+      <w:r/>
+    </w:p>
+    <w:p>
+      <w:pPr>
+        <w:spacing w:after="160" w:line="245" w:lineRule="auto"/>
+      </w:pPr>
+      <w:r>
+        <w:rPr>
+          <w:rFonts w:ascii="Consolas" w:hAnsi="Consolas"/>
+          <w:sz w:val="18"/>
+        </w:rPr>
+        <w:t xml:space="preserve">  acquiresleep(&amp;swap_lock);</w:t>
+      </w:r>
+      <w:r>
+        <w:br/>
+      </w:r>
+      <w:r>
+        <w:rPr>
+          <w:rFonts w:ascii="Consolas" w:hAnsi="Consolas"/>
+          <w:sz w:val="18"/>
+        </w:rPr>
+      </w:r>
+      <w:r>
+        <w:br/>
+      </w:r>
+      <w:r>
+        <w:rPr>
+          <w:rFonts w:ascii="Consolas" w:hAnsi="Consolas"/>
+          <w:sz w:val="18"/>
+        </w:rPr>
+        <w:t xml:space="preserve">  swap_read(slot, (uint64)mem);</w:t>
+      </w:r>
+      <w:r>
+        <w:br/>
+      </w:r>
+      <w:r>
+        <w:rPr>
+          <w:rFonts w:ascii="Consolas" w:hAnsi="Consolas"/>
+          <w:sz w:val="18"/>
+        </w:rPr>
+        <w:t xml:space="preserve">  *pte = PA2PTE(mem) | perm | PTE_V;</w:t>
+      </w:r>
+      <w:r>
+        <w:br/>
+      </w:r>
+      <w:r>
+        <w:rPr>
+          <w:rFonts w:ascii="Consolas" w:hAnsi="Consolas"/>
+          <w:sz w:val="18"/>
+        </w:rPr>
+        <w:t xml:space="preserve">  swap_slot_free(slot);</w:t>
+      </w:r>
+      <w:r>
+        <w:br/>
+      </w:r>
+      <w:r>
+        <w:rPr>
+          <w:rFonts w:ascii="Consolas" w:hAnsi="Consolas"/>
+          <w:sz w:val="18"/>
+        </w:rPr>
+      </w:r>
+      <w:r>
+        <w:br/>
+      </w:r>
+      <w:r>
+        <w:rPr>
+          <w:rFonts w:ascii="Consolas" w:hAnsi="Consolas"/>
+          <w:sz w:val="18"/>
+        </w:rPr>
+        <w:t xml:space="preserve">  releasesleep(&amp;swap_lock);</w:t>
+      </w:r>
+    </w:p>
+    <w:p>
+      <w:r>
+        <w:t xml:space="preserve">The new PTE distinguishes saved disk content from an untouched lazy hole. The frame is released after writing it; the later read restores contents and permissions. Other changes track eligible frames, encode slots, reserve the disk area and free saved slots on unmap. Sleeping I/O must remain outside spinlocks. These are project-specific integration choices using standard paging concepts. </w:t>
+      </w:r>
+      <w:hyperlink r:id="rId16">
+        <w:r>
+          <w:rPr>
+            <w:color w:val="1D4ED8"/>
+            <w:u w:val="single"/>
+          </w:rPr>
+          <w:t>[R6]</w:t>
+        </w:r>
+      </w:hyperlink>
+      <w:r/>
+    </w:p>
+    <w:p>
+      <w:r>
+        <w:t>The observed no-swap 12 MiB child exits -1 under an 8 MiB usable-memory limit. With swapping, memhog verifies all 3072 pages with zero bad pages and exits 0. Full quoted outputs are in Appendix F. The finite swap area and one-CPU eviction boundary remain applicable.</w:t>
+      </w:r>
+    </w:p>
+    <w:p>
+      <w:pPr>
+        <w:pStyle w:val="Heading1"/>
+      </w:pPr>
+      <w:r>
+        <w:t>Appendix E Exact FIFO and Clock decisions</w:t>
+      </w:r>
+    </w:p>
+    <w:p>
+      <w:r>
+        <w:t>The before-swap checkpoint has no victim-selection engine. v0.4 adds both alternatives in pick_victim. SWAP_POLICY=1 chooses FIFO; SWAP_POLICY=2 chooses Clock. The common evictable predicate excludes COW-marked and multiply referenced frames, and confirms a valid user mapping still refers to the candidate frame.</w:t>
+      </w:r>
+    </w:p>
+    <w:p>
+      <w:pPr>
+        <w:pStyle w:val="Heading2"/>
+      </w:pPr>
+      <w:r>
+        <w:t>FIFO: smallest sequence among eligible frames</w:t>
+      </w:r>
+    </w:p>
+    <w:p>
+      <w:r>
+        <w:t xml:space="preserve">kernel/swap.c, pick_victim(void), v0.4, lines 206-215. </w:t>
+      </w:r>
+      <w:hyperlink r:id="rId48">
+        <w:r>
+          <w:rPr>
+            <w:color w:val="1D4ED8"/>
+            <w:u w:val="single"/>
+          </w:rPr>
+          <w:t>[S11]</w:t>
+        </w:r>
+      </w:hyperlink>
+      <w:r/>
+    </w:p>
+    <w:p>
+      <w:pPr>
+        <w:spacing w:after="160" w:line="245" w:lineRule="auto"/>
+      </w:pPr>
+      <w:r>
+        <w:rPr>
+          <w:rFonts w:ascii="Consolas" w:hAnsi="Consolas"/>
+          <w:sz w:val="18"/>
+        </w:rPr>
+        <w:t xml:space="preserve">  for(int i = 0; i &lt; NFRAMES; i++){</w:t>
+      </w:r>
+      <w:r>
+        <w:br/>
+      </w:r>
+      <w:r>
+        <w:rPr>
+          <w:rFonts w:ascii="Consolas" w:hAnsi="Consolas"/>
+          <w:sz w:val="18"/>
+        </w:rPr>
+        <w:t xml:space="preserve">    if(frames[i].pt != 0 &amp;&amp;</w:t>
+      </w:r>
+      <w:r>
+        <w:br/>
+      </w:r>
+      <w:r>
+        <w:rPr>
+          <w:rFonts w:ascii="Consolas" w:hAnsi="Consolas"/>
+          <w:sz w:val="18"/>
+        </w:rPr>
+        <w:t xml:space="preserve">       frames[i].seq &lt; best_seq &amp;&amp;</w:t>
+      </w:r>
+      <w:r>
+        <w:br/>
+      </w:r>
+      <w:r>
+        <w:rPr>
+          <w:rFonts w:ascii="Consolas" w:hAnsi="Consolas"/>
+          <w:sz w:val="18"/>
+        </w:rPr>
+        <w:t xml:space="preserve">       evictable(i)){</w:t>
+      </w:r>
+      <w:r>
+        <w:br/>
+      </w:r>
+      <w:r>
+        <w:rPr>
+          <w:rFonts w:ascii="Consolas" w:hAnsi="Consolas"/>
+          <w:sz w:val="18"/>
+        </w:rPr>
+        <w:t xml:space="preserve">      best = i;</w:t>
+      </w:r>
+      <w:r>
+        <w:br/>
+      </w:r>
+      <w:r>
+        <w:rPr>
+          <w:rFonts w:ascii="Consolas" w:hAnsi="Consolas"/>
+          <w:sz w:val="18"/>
+        </w:rPr>
+        <w:t xml:space="preserve">      best_seq = frames[i].seq;</w:t>
+      </w:r>
+      <w:r>
+        <w:br/>
+      </w:r>
+      <w:r>
+        <w:rPr>
+          <w:rFonts w:ascii="Consolas" w:hAnsi="Consolas"/>
+          <w:sz w:val="18"/>
+        </w:rPr>
+        <w:t xml:space="preserve">    }</w:t>
+      </w:r>
+      <w:r>
+        <w:br/>
+      </w:r>
+      <w:r>
+        <w:rPr>
+          <w:rFonts w:ascii="Consolas" w:hAnsi="Consolas"/>
+          <w:sz w:val="18"/>
+        </w:rPr>
+        <w:t xml:space="preserve">  }</w:t>
+      </w:r>
+      <w:r>
+        <w:br/>
+      </w:r>
+      <w:r>
+        <w:rPr>
+          <w:rFonts w:ascii="Consolas" w:hAnsi="Consolas"/>
+          <w:sz w:val="18"/>
+        </w:rPr>
+      </w:r>
+      <w:r>
+        <w:br/>
+      </w:r>
+      <w:r>
+        <w:rPr>
+          <w:rFonts w:ascii="Consolas" w:hAnsi="Consolas"/>
+          <w:sz w:val="18"/>
+        </w:rPr>
+        <w:t xml:space="preserve">  return best;</w:t>
+      </w:r>
+    </w:p>
+    <w:p>
+      <w:r>
+        <w:t>The surrounding code initializes best to -1 and best_seq to the largest uint64 value. Tracking assigns increasing sequence values, so this branch chooses the oldest tracked eligible frame.</w:t>
+      </w:r>
+    </w:p>
+    <w:p>
+      <w:pPr>
+        <w:pStyle w:val="Heading2"/>
+      </w:pPr>
+      <w:r>
+        <w:t>Clock: advance the hand and give accessed pages another chance</w:t>
+      </w:r>
+    </w:p>
+    <w:p>
+      <w:r>
+        <w:t xml:space="preserve">kernel/swap.c, pick_victim(void), v0.4, lines 218-232. </w:t>
+      </w:r>
+      <w:hyperlink r:id="rId49">
+        <w:r>
+          <w:rPr>
+            <w:color w:val="1D4ED8"/>
+            <w:u w:val="single"/>
+          </w:rPr>
+          <w:t>[S12]</w:t>
+        </w:r>
+      </w:hyperlink>
+      <w:r/>
+    </w:p>
+    <w:p>
+      <w:pPr>
+        <w:spacing w:after="160" w:line="245" w:lineRule="auto"/>
+      </w:pPr>
+      <w:r>
+        <w:rPr>
+          <w:rFonts w:ascii="Consolas" w:hAnsi="Consolas"/>
+          <w:sz w:val="18"/>
+        </w:rPr>
+        <w:t xml:space="preserve">    int i = clock_hand;</w:t>
+      </w:r>
+      <w:r>
+        <w:br/>
+      </w:r>
+      <w:r>
+        <w:rPr>
+          <w:rFonts w:ascii="Consolas" w:hAnsi="Consolas"/>
+          <w:sz w:val="18"/>
+        </w:rPr>
+        <w:t xml:space="preserve">    clock_hand = (clock_hand + 1) % NFRAMES;</w:t>
+      </w:r>
+      <w:r>
+        <w:br/>
+      </w:r>
+      <w:r>
+        <w:rPr>
+          <w:rFonts w:ascii="Consolas" w:hAnsi="Consolas"/>
+          <w:sz w:val="18"/>
+        </w:rPr>
+      </w:r>
+      <w:r>
+        <w:br/>
+      </w:r>
+      <w:r>
+        <w:rPr>
+          <w:rFonts w:ascii="Consolas" w:hAnsi="Consolas"/>
+          <w:sz w:val="18"/>
+        </w:rPr>
+        <w:t xml:space="preserve">    if(!evictable(i))</w:t>
+      </w:r>
+      <w:r>
+        <w:br/>
+      </w:r>
+      <w:r>
+        <w:rPr>
+          <w:rFonts w:ascii="Consolas" w:hAnsi="Consolas"/>
+          <w:sz w:val="18"/>
+        </w:rPr>
+        <w:t xml:space="preserve">      continue;</w:t>
+      </w:r>
+      <w:r>
+        <w:br/>
+      </w:r>
+      <w:r>
+        <w:rPr>
+          <w:rFonts w:ascii="Consolas" w:hAnsi="Consolas"/>
+          <w:sz w:val="18"/>
+        </w:rPr>
+      </w:r>
+      <w:r>
+        <w:br/>
+      </w:r>
+      <w:r>
+        <w:rPr>
+          <w:rFonts w:ascii="Consolas" w:hAnsi="Consolas"/>
+          <w:sz w:val="18"/>
+        </w:rPr>
+        <w:t xml:space="preserve">    pte_t *pte = walk(frames[i].pt, frames[i].va, 0);</w:t>
+      </w:r>
+      <w:r>
+        <w:br/>
+      </w:r>
+      <w:r>
+        <w:rPr>
+          <w:rFonts w:ascii="Consolas" w:hAnsi="Consolas"/>
+          <w:sz w:val="18"/>
+        </w:rPr>
+      </w:r>
+      <w:r>
+        <w:br/>
+      </w:r>
+      <w:r>
+        <w:rPr>
+          <w:rFonts w:ascii="Consolas" w:hAnsi="Consolas"/>
+          <w:sz w:val="18"/>
+        </w:rPr>
+        <w:t xml:space="preserve">    if(*pte &amp; PTE_A){</w:t>
+      </w:r>
+      <w:r>
+        <w:br/>
+      </w:r>
+      <w:r>
+        <w:rPr>
+          <w:rFonts w:ascii="Consolas" w:hAnsi="Consolas"/>
+          <w:sz w:val="18"/>
+        </w:rPr>
+        <w:t xml:space="preserve">      *pte &amp;= ~PTE_A;</w:t>
+      </w:r>
+      <w:r>
+        <w:br/>
+      </w:r>
+      <w:r>
+        <w:rPr>
+          <w:rFonts w:ascii="Consolas" w:hAnsi="Consolas"/>
+          <w:sz w:val="18"/>
+        </w:rPr>
+        <w:t xml:space="preserve">      sfence_vma();</w:t>
+      </w:r>
+      <w:r>
+        <w:br/>
+      </w:r>
+      <w:r>
+        <w:rPr>
+          <w:rFonts w:ascii="Consolas" w:hAnsi="Consolas"/>
+          <w:sz w:val="18"/>
+        </w:rPr>
+        <w:t xml:space="preserve">      continue;</w:t>
+      </w:r>
+      <w:r>
+        <w:br/>
+      </w:r>
+      <w:r>
+        <w:rPr>
+          <w:rFonts w:ascii="Consolas" w:hAnsi="Consolas"/>
+          <w:sz w:val="18"/>
+        </w:rPr>
+        <w:t xml:space="preserve">    }</w:t>
+      </w:r>
+      <w:r>
+        <w:br/>
+      </w:r>
+      <w:r>
+        <w:rPr>
+          <w:rFonts w:ascii="Consolas" w:hAnsi="Consolas"/>
+          <w:sz w:val="18"/>
+        </w:rPr>
+      </w:r>
+      <w:r>
+        <w:br/>
+      </w:r>
+      <w:r>
+        <w:rPr>
+          <w:rFonts w:ascii="Consolas" w:hAnsi="Consolas"/>
+          <w:sz w:val="18"/>
+        </w:rPr>
+        <w:t xml:space="preserve">    return i;</w:t>
+      </w:r>
+    </w:p>
+    <w:p>
+      <w:r>
+        <w:t xml:space="preserve">The surrounding loop scans at most twice through the frame table and returns failure if it finds no victim. Clearing PTE_A and fencing gives a recently accessed eligible page another chance. The implementation is an approximation based on accessed bits, not an exact LRU order. </w:t>
+      </w:r>
+      <w:hyperlink r:id="rId17">
+        <w:r>
+          <w:rPr>
+            <w:color w:val="1D4ED8"/>
+            <w:u w:val="single"/>
+          </w:rPr>
+          <w:t>[R7]</w:t>
+        </w:r>
+      </w:hyperlink>
+      <w:r>
+        <w:t xml:space="preserve"> </w:t>
+      </w:r>
+      <w:hyperlink r:id="rId25">
+        <w:r>
+          <w:rPr>
+            <w:color w:val="1D4ED8"/>
+            <w:u w:val="single"/>
+          </w:rPr>
+          <w:t>[R8]</w:t>
+        </w:r>
+      </w:hyperlink>
+      <w:r/>
+    </w:p>
+    <w:p>
+      <w:r>
+        <w:t xml:space="preserve">The recorded hotcold phases were FIFO 8006 swap ins and 8007 outs, versus Clock 7691 and 7684. These are phase deltas from one historical run each before the pipe repair. They do not establish a runtime speedup or universal policy ranking. R14 explains locality background; R15 supplies historical FIFO anomaly context. Neither research experiment is claimed as reproduced here. </w:t>
+      </w:r>
+      <w:hyperlink r:id="rId50">
+        <w:r>
+          <w:rPr>
+            <w:color w:val="1D4ED8"/>
+            <w:u w:val="single"/>
+          </w:rPr>
+          <w:t>[R14]</w:t>
+        </w:r>
+      </w:hyperlink>
+      <w:r>
+        <w:t xml:space="preserve"> </w:t>
+      </w:r>
+      <w:hyperlink r:id="rId51">
+        <w:r>
+          <w:rPr>
+            <w:color w:val="1D4ED8"/>
+            <w:u w:val="single"/>
+          </w:rPr>
+          <w:t>[R15]</w:t>
+        </w:r>
+      </w:hyperlink>
+      <w:r/>
+    </w:p>
+    <w:p>
+      <w:pPr>
+        <w:pStyle w:val="Heading1"/>
+      </w:pPr>
+      <w:r>
+        <w:t>Appendix F Quoted before-and-after outputs</w:t>
+      </w:r>
+    </w:p>
+    <w:p>
+      <w:r>
+        <w:t>The blocks below transcribe the preserved terminal captures and supplied baseline transcript. They are observed historical output, not a new console run or invented expected text. Original screenshots are linked from sections 7, 12 and 15 and the GitHub evidence index. The labels identify the compared checkpoints.</w:t>
+      </w:r>
+    </w:p>
+    <w:p>
+      <w:pPr>
+        <w:pStyle w:val="Heading2"/>
+      </w:pPr>
+      <w:r>
+        <w:t>Reservation and sparse access: v0.0 -&gt; v0.1</w:t>
+      </w:r>
+    </w:p>
+    <w:p>
+      <w:pPr>
+        <w:spacing w:after="160" w:line="245" w:lineRule="auto"/>
+      </w:pPr>
+      <w:r>
+        <w:rPr>
+          <w:rFonts w:ascii="Consolas" w:hAnsi="Consolas"/>
+          <w:sz w:val="18"/>
+        </w:rPr>
+        <w:t>Before, command: baseline</w:t>
+      </w:r>
+      <w:r>
+        <w:br/>
+      </w:r>
+      <w:r>
+        <w:rPr>
+          <w:rFonts w:ascii="Consolas" w:hAnsi="Consolas"/>
+          <w:sz w:val="18"/>
+        </w:rPr>
+        <w:t>baseline: sbrk(200MB) failed (expected on stock xv6)</w:t>
+      </w:r>
+      <w:r>
+        <w:br/>
+      </w:r>
+      <w:r>
+        <w:rPr>
+          <w:rFonts w:ascii="Consolas" w:hAnsi="Consolas"/>
+          <w:sz w:val="18"/>
+        </w:rPr>
+      </w:r>
+      <w:r>
+        <w:br/>
+      </w:r>
+      <w:r>
+        <w:rPr>
+          <w:rFonts w:ascii="Consolas" w:hAnsi="Consolas"/>
+          <w:sz w:val="18"/>
+        </w:rPr>
+        <w:t>After, commands: baseline, lazytest</w:t>
+      </w:r>
+      <w:r>
+        <w:br/>
+      </w:r>
+      <w:r>
+        <w:rPr>
+          <w:rFonts w:ascii="Consolas" w:hAnsi="Consolas"/>
+          <w:sz w:val="18"/>
+        </w:rPr>
+        <w:t>baseline: sbrk(200MB) succeeded</w:t>
+      </w:r>
+      <w:r>
+        <w:br/>
+      </w:r>
+      <w:r>
+        <w:rPr>
+          <w:rFonts w:ascii="Consolas" w:hAnsi="Consolas"/>
+          <w:sz w:val="18"/>
+        </w:rPr>
+        <w:t>lazytest: OK (656 pages touched)</w:t>
+      </w:r>
+    </w:p>
+    <w:p>
+      <w:pPr>
+        <w:pStyle w:val="Heading2"/>
+      </w:pPr>
+      <w:r>
+        <w:t>Fork correctness and recorded loop: 28c7475 -&gt; v0.4</w:t>
+      </w:r>
+    </w:p>
+    <w:p>
+      <w:pPr>
+        <w:spacing w:after="160" w:line="245" w:lineRule="auto"/>
+      </w:pPr>
+      <w:r>
+        <w:rPr>
+          <w:rFonts w:ascii="Consolas" w:hAnsi="Consolas"/>
+          <w:sz w:val="18"/>
+        </w:rPr>
+        <w:t>Before, commands: cowtest, forkbench</w:t>
+      </w:r>
+      <w:r>
+        <w:br/>
+      </w:r>
+      <w:r>
+        <w:rPr>
+          <w:rFonts w:ascii="Consolas" w:hAnsi="Consolas"/>
+          <w:sz w:val="18"/>
+        </w:rPr>
+        <w:t>cowtest: fork failed</w:t>
+      </w:r>
+      <w:r>
+        <w:br/>
+      </w:r>
+      <w:r>
+        <w:rPr>
+          <w:rFonts w:ascii="Consolas" w:hAnsi="Consolas"/>
+          <w:sz w:val="18"/>
+        </w:rPr>
+        <w:t>forkbench: 50 forks of a 20 MB process took 38 ticks</w:t>
+      </w:r>
+      <w:r>
+        <w:br/>
+      </w:r>
+      <w:r>
+        <w:rPr>
+          <w:rFonts w:ascii="Consolas" w:hAnsi="Consolas"/>
+          <w:sz w:val="18"/>
+        </w:rPr>
+      </w:r>
+      <w:r>
+        <w:br/>
+      </w:r>
+      <w:r>
+        <w:rPr>
+          <w:rFonts w:ascii="Consolas" w:hAnsi="Consolas"/>
+          <w:sz w:val="18"/>
+        </w:rPr>
+        <w:t>After, commands: cowtest, forkbench</w:t>
+      </w:r>
+      <w:r>
+        <w:br/>
+      </w:r>
+      <w:r>
+        <w:rPr>
+          <w:rFonts w:ascii="Consolas" w:hAnsi="Consolas"/>
+          <w:sz w:val="18"/>
+        </w:rPr>
+        <w:t>cowtest: OK</w:t>
+      </w:r>
+      <w:r>
+        <w:br/>
+      </w:r>
+      <w:r>
+        <w:rPr>
+          <w:rFonts w:ascii="Consolas" w:hAnsi="Consolas"/>
+          <w:sz w:val="18"/>
+        </w:rPr>
+        <w:t>forkbench: 50 forks of a 20 MB process took 6 ticks</w:t>
+      </w:r>
+    </w:p>
+    <w:p>
+      <w:pPr>
+        <w:pStyle w:val="Heading2"/>
+      </w:pPr>
+      <w:r>
+        <w:t>Pressure: before-swap -&gt; v0.4, 1 CPU and 8 MiB usable RAM</w:t>
+      </w:r>
+    </w:p>
+    <w:p>
+      <w:pPr>
+        <w:spacing w:after="160" w:line="245" w:lineRule="auto"/>
+      </w:pPr>
+      <w:r>
+        <w:rPr>
+          <w:rFonts w:ascii="Consolas" w:hAnsi="Consolas"/>
+          <w:sz w:val="18"/>
+        </w:rPr>
+        <w:t>Without swap, command: memhog 12</w:t>
+      </w:r>
+      <w:r>
+        <w:br/>
+      </w:r>
+      <w:r>
+        <w:rPr>
+          <w:rFonts w:ascii="Consolas" w:hAnsi="Consolas"/>
+          <w:sz w:val="18"/>
+        </w:rPr>
+        <w:t>memhog: starting 12 MB workload</w:t>
+      </w:r>
+      <w:r>
+        <w:br/>
+      </w:r>
+      <w:r>
+        <w:rPr>
+          <w:rFonts w:ascii="Consolas" w:hAnsi="Consolas"/>
+          <w:sz w:val="18"/>
+        </w:rPr>
+        <w:t>memhog: child exit status -1</w:t>
+      </w:r>
+      <w:r>
+        <w:br/>
+      </w:r>
+      <w:r>
+        <w:rPr>
+          <w:rFonts w:ascii="Consolas" w:hAnsi="Consolas"/>
+          <w:sz w:val="18"/>
+        </w:rPr>
+      </w:r>
+      <w:r>
+        <w:br/>
+      </w:r>
+      <w:r>
+        <w:rPr>
+          <w:rFonts w:ascii="Consolas" w:hAnsi="Consolas"/>
+          <w:sz w:val="18"/>
+        </w:rPr>
+        <w:t>With swap, command: memhog 12</w:t>
+      </w:r>
+      <w:r>
+        <w:br/>
+      </w:r>
+      <w:r>
+        <w:rPr>
+          <w:rFonts w:ascii="Consolas" w:hAnsi="Consolas"/>
+          <w:sz w:val="18"/>
+        </w:rPr>
+        <w:t>memhog: 12 MB, 3072 pages, 0 bad, swap outs 4369, swap ins 3072</w:t>
+      </w:r>
+      <w:r>
+        <w:br/>
+      </w:r>
+      <w:r>
+        <w:rPr>
+          <w:rFonts w:ascii="Consolas" w:hAnsi="Consolas"/>
+          <w:sz w:val="18"/>
+        </w:rPr>
+        <w:t>memhog: child exit status 0</w:t>
+      </w:r>
+    </w:p>
+    <w:p>
+      <w:r>
+        <w:t>The test commands historically print MB for powers-of-two byte sizes; this report uses MiB. The 4 MiB control succeeds in both pressure configurations. The after-swap original also shows swapfork: child bad=0 and swapfork: OK. The final v0.4 full-suite capture ends ALL TESTS PASSED; no inherited usertests.c edits occur between v0.0 and v0.4.</w:t>
+      </w:r>
+    </w:p>
+    <w:p>
+      <w:r>
+        <w:t>Provenance: eager-baseline.txt; lazy-allocation.png; fork-before-cow.png; cow-validation.png; fork-benchmark.png; no-swap-pressure.png; swap-pressure.png; swap-fork.png; regression-tests.png. These are under docs/results/memory. Expected behavior is described in the prose; the quoted measurements remain tied to their recorded versions.</w:t>
+      </w:r>
+    </w:p>
+    <w:p>
+      <w:pPr>
+        <w:pStyle w:val="Heading1"/>
+      </w:pPr>
+      <w:r>
         <w:t>References for design and provenance</w:t>
       </w:r>
     </w:p>
@@ -11435,7 +14771,7 @@
       <w:pPr>
         <w:spacing w:after="80"/>
       </w:pPr>
-      <w:hyperlink r:id="rId13">
+      <w:hyperlink r:id="rId18">
         <w:r>
           <w:rPr>
             <w:color w:val="1D4ED8"/>
@@ -11469,7 +14805,7 @@
       <w:pPr>
         <w:spacing w:after="80"/>
       </w:pPr>
-      <w:hyperlink r:id="rId38">
+      <w:hyperlink r:id="rId52">
         <w:r>
           <w:rPr>
             <w:color w:val="1D4ED8"/>
@@ -11503,7 +14839,7 @@
       <w:pPr>
         <w:spacing w:after="80"/>
       </w:pPr>
-      <w:hyperlink r:id="rId14">
+      <w:hyperlink r:id="rId13">
         <w:r>
           <w:rPr>
             <w:color w:val="1D4ED8"/>
@@ -11537,7 +14873,7 @@
       <w:pPr>
         <w:spacing w:after="80"/>
       </w:pPr>
-      <w:hyperlink r:id="rId15">
+      <w:hyperlink r:id="rId14">
         <w:r>
           <w:rPr>
             <w:color w:val="1D4ED8"/>
@@ -11571,7 +14907,7 @@
       <w:pPr>
         <w:spacing w:after="80"/>
       </w:pPr>
-      <w:hyperlink r:id="rId16">
+      <w:hyperlink r:id="rId15">
         <w:r>
           <w:rPr>
             <w:color w:val="1D4ED8"/>
@@ -11605,7 +14941,7 @@
       <w:pPr>
         <w:spacing w:after="80"/>
       </w:pPr>
-      <w:hyperlink r:id="rId17">
+      <w:hyperlink r:id="rId16">
         <w:r>
           <w:rPr>
             <w:color w:val="1D4ED8"/>
@@ -11639,7 +14975,7 @@
       <w:pPr>
         <w:spacing w:after="80"/>
       </w:pPr>
-      <w:hyperlink r:id="rId18">
+      <w:hyperlink r:id="rId17">
         <w:r>
           <w:rPr>
             <w:color w:val="1D4ED8"/>
@@ -11868,6 +15204,87 @@
       </w:pPr>
       <w:r>
         <w:t>Documents the course-specific xv6-labs-2020 starter repository and explains its difference from the book's xv6-riscv source. Its historical clone command is not a project build instruction. Accessed 28 October 2026.</w:t>
+      </w:r>
+    </w:p>
+    <w:p>
+      <w:pPr>
+        <w:pStyle w:val="Heading1"/>
+      </w:pPr>
+      <w:r>
+        <w:t>Research papers and relevance</w:t>
+      </w:r>
+    </w:p>
+    <w:p>
+      <w:pPr>
+        <w:keepNext/>
+      </w:pPr>
+      <w:r>
+        <w:rPr>
+          <w:b/>
+        </w:rPr>
+        <w:t>R14  Denning 1968 The working set model for program behavior</w:t>
+      </w:r>
+    </w:p>
+    <w:p>
+      <w:pPr>
+        <w:spacing w:after="80"/>
+      </w:pPr>
+      <w:hyperlink r:id="rId50">
+        <w:r>
+          <w:rPr>
+            <w:color w:val="1D4ED8"/>
+            <w:u w:val="single"/>
+            <w:sz w:val="19"/>
+          </w:rPr>
+          <w:t>https://doi.org/10.1145/363095.363141</w:t>
+        </w:r>
+      </w:hyperlink>
+    </w:p>
+    <w:p>
+      <w:pPr>
+        <w:spacing w:after="220"/>
+      </w:pPr>
+      <w:r>
+        <w:t>Peter J. Denning. Communications of the ACM 11(5), 323-333, May 1968. DOI 10.1145/363095.363141. Research background for locality and the pages actively used by a computation. The full author-hosted paper was checked. Our sparse and hot/cold tests are illustrations of access patterns; the project does not implement Denning's working-set scheduler. Accessed 28 October 2026.</w:t>
+      </w:r>
+    </w:p>
+    <w:p>
+      <w:pPr>
+        <w:keepNext/>
+      </w:pPr>
+      <w:r>
+        <w:rPr>
+          <w:b/>
+        </w:rPr>
+        <w:t>R15  Belady, Nelson and Shedler 1969 An anomaly in space-time characteristics of certain programs running in a paging machine</w:t>
+      </w:r>
+    </w:p>
+    <w:p>
+      <w:pPr>
+        <w:spacing w:after="80"/>
+      </w:pPr>
+      <w:hyperlink r:id="rId51">
+        <w:r>
+          <w:rPr>
+            <w:color w:val="1D4ED8"/>
+            <w:u w:val="single"/>
+            <w:sz w:val="19"/>
+          </w:rPr>
+          <w:t>https://research.ibm.com/publications/an-anomaly-in-space-time-characteristics-of-certain-programs-running-in-a-paging-machine</w:t>
+        </w:r>
+      </w:hyperlink>
+    </w:p>
+    <w:p>
+      <w:pPr>
+        <w:spacing w:after="220"/>
+      </w:pPr>
+      <w:r>
+        <w:t>L. A. Belady, R. A. Nelson and G. S. Shedler. Communications of the ACM, June 1969. Publisher DOI 10.1145/363011.363155 is linked by the IBM Research record. The primary record and abstract were checked; the ACM full text was unavailable through the research tool. It provides historical context for FIFO policy anomalies. Our experiments do not reproduce that paper's anomaly experiment. Accessed 28 October 2026.</w:t>
+      </w:r>
+    </w:p>
+    <w:p>
+      <w:r>
+        <w:t>These references were added during this draft revision as literature context. Denning's model helps explain why the pages actively used matter more than the size of a sparse reservation. The IBM research record motivates care when generalizing a FIFO result. The project's lazy/COW implementations correspond to the MIT assignments cited earlier; the swap engine and combined tests are this project's implementation and integration work. No new algorithm, exact working-set scheduler, reproduced anomaly experiment or official MIT grade is asserted.</w:t>
       </w:r>
     </w:p>
     <w:sectPr>

</xml_diff>